<commit_message>
docs: reconstruir Relatório Final e PDCA no formato do template institucional
Co-authored-by: Luis Felipe de Oliveira Monteiro <LuisMonteiro0211@users.noreply.github.com>
</commit_message>
<xml_diff>
--- a/docs/extensao/Relatorio_Final_Preenchido_Luis_Felipe.docx
+++ b/docs/extensao/Relatorio_Final_Preenchido_Luis_Felipe.docx
@@ -2,94 +2,745 @@
 <file path=word/document.xml><?xml version="1.0" encoding="utf-8"?>
 <w:document xmlns:wpc="http://schemas.microsoft.com/office/word/2010/wordprocessingCanvas" xmlns:mo="http://schemas.microsoft.com/office/mac/office/2008/main" xmlns:mc="http://schemas.openxmlformats.org/markup-compatibility/2006" xmlns:mv="urn:schemas-microsoft-com:mac:vml" xmlns:o="urn:schemas-microsoft-com:office:office" xmlns:r="http://schemas.openxmlformats.org/officeDocument/2006/relationships" xmlns:m="http://schemas.openxmlformats.org/officeDocument/2006/math" xmlns:v="urn:schemas-microsoft-com:vml" xmlns:wp14="http://schemas.microsoft.com/office/word/2010/wordprocessingDrawing" xmlns:wp="http://schemas.openxmlformats.org/drawingml/2006/wordprocessingDrawing" xmlns:w10="urn:schemas-microsoft-com:office:word" xmlns:w="http://schemas.openxmlformats.org/wordprocessingml/2006/main" xmlns:w14="http://schemas.microsoft.com/office/word/2010/wordml" xmlns:wpg="http://schemas.microsoft.com/office/word/2010/wordprocessingGroup" xmlns:wpi="http://schemas.microsoft.com/office/word/2010/wordprocessingInk" xmlns:wne="http://schemas.microsoft.com/office/word/2006/wordml" xmlns:wps="http://schemas.microsoft.com/office/word/2010/wordprocessingShape" mc:Ignorable="w14 wp14">
   <w:body>
+    <w:tbl>
+      <w:tblPr>
+        <w:tblStyle w:val="TableGrid"/>
+        <w:tblW w:type="auto" w:w="0"/>
+        <w:jc w:val="center"/>
+        <w:tblLayout w:type="fixed"/>
+        <w:tblLook w:firstColumn="1" w:firstRow="1" w:lastColumn="0" w:lastRow="0" w:noHBand="0" w:noVBand="1" w:val="04A0"/>
+      </w:tblPr>
+      <w:tblGrid>
+        <w:gridCol w:w="4535"/>
+        <w:gridCol w:w="4535"/>
+      </w:tblGrid>
+      <w:tr>
+        <w:tc>
+          <w:tcPr>
+            <w:tcW w:type="dxa" w:w="9070"/>
+            <w:gridSpan w:val="2"/>
+            <w:shd w:val="clear" w:color="auto" w:fill="BFBFBF"/>
+          </w:tcPr>
+          <w:p>
+            <w:pPr>
+              <w:spacing w:after="40"/>
+            </w:pPr>
+            <w:r/>
+            <w:r>
+              <w:rPr>
+                <w:b/>
+                <w:sz w:val="20"/>
+              </w:rPr>
+              <w:t>DADOS DO ALUNO:</w:t>
+            </w:r>
+          </w:p>
+        </w:tc>
+      </w:tr>
+      <w:tr>
+        <w:tc>
+          <w:tcPr>
+            <w:tcW w:type="dxa" w:w="2835"/>
+            <w:shd w:val="clear" w:color="auto" w:fill="D9D9D9"/>
+          </w:tcPr>
+          <w:p>
+            <w:pPr>
+              <w:spacing w:after="40"/>
+            </w:pPr>
+            <w:r/>
+            <w:r>
+              <w:rPr>
+                <w:b/>
+                <w:sz w:val="20"/>
+              </w:rPr>
+              <w:t>Aluno:</w:t>
+            </w:r>
+          </w:p>
+        </w:tc>
+        <w:tc>
+          <w:tcPr>
+            <w:tcW w:type="dxa" w:w="6236"/>
+          </w:tcPr>
+          <w:p>
+            <w:pPr>
+              <w:spacing w:after="40"/>
+            </w:pPr>
+            <w:r/>
+            <w:r>
+              <w:rPr>
+                <w:b w:val="0"/>
+                <w:sz w:val="20"/>
+              </w:rPr>
+              <w:t>Luís Felipe de Oliveira Monteiro</w:t>
+            </w:r>
+          </w:p>
+        </w:tc>
+      </w:tr>
+      <w:tr>
+        <w:tc>
+          <w:tcPr>
+            <w:tcW w:type="dxa" w:w="2835"/>
+            <w:shd w:val="clear" w:color="auto" w:fill="D9D9D9"/>
+          </w:tcPr>
+          <w:p>
+            <w:pPr>
+              <w:spacing w:after="40"/>
+            </w:pPr>
+            <w:r/>
+            <w:r>
+              <w:rPr>
+                <w:b/>
+                <w:sz w:val="20"/>
+              </w:rPr>
+              <w:t>RA:</w:t>
+            </w:r>
+          </w:p>
+        </w:tc>
+        <w:tc>
+          <w:tcPr>
+            <w:tcW w:type="dxa" w:w="6236"/>
+          </w:tcPr>
+          <w:p>
+            <w:pPr>
+              <w:spacing w:after="40"/>
+            </w:pPr>
+            <w:r/>
+            <w:r>
+              <w:rPr>
+                <w:b w:val="0"/>
+                <w:sz w:val="20"/>
+              </w:rPr>
+              <w:t>3823284706</w:t>
+            </w:r>
+          </w:p>
+        </w:tc>
+      </w:tr>
+      <w:tr>
+        <w:tc>
+          <w:tcPr>
+            <w:tcW w:type="dxa" w:w="2835"/>
+            <w:shd w:val="clear" w:color="auto" w:fill="D9D9D9"/>
+          </w:tcPr>
+          <w:p>
+            <w:pPr>
+              <w:spacing w:after="40"/>
+            </w:pPr>
+            <w:r/>
+            <w:r>
+              <w:rPr>
+                <w:b/>
+                <w:sz w:val="20"/>
+              </w:rPr>
+              <w:t>POLO / UNIDADE:</w:t>
+            </w:r>
+          </w:p>
+        </w:tc>
+        <w:tc>
+          <w:tcPr>
+            <w:tcW w:type="dxa" w:w="6236"/>
+          </w:tcPr>
+          <w:p>
+            <w:pPr>
+              <w:spacing w:after="40"/>
+            </w:pPr>
+            <w:r/>
+            <w:r>
+              <w:rPr>
+                <w:b w:val="0"/>
+                <w:sz w:val="20"/>
+              </w:rPr>
+              <w:t>Polo Franca</w:t>
+            </w:r>
+          </w:p>
+        </w:tc>
+      </w:tr>
+      <w:tr>
+        <w:tc>
+          <w:tcPr>
+            <w:tcW w:type="dxa" w:w="2835"/>
+            <w:shd w:val="clear" w:color="auto" w:fill="D9D9D9"/>
+          </w:tcPr>
+          <w:p>
+            <w:pPr>
+              <w:spacing w:after="40"/>
+            </w:pPr>
+            <w:r/>
+            <w:r>
+              <w:rPr>
+                <w:b/>
+                <w:sz w:val="20"/>
+              </w:rPr>
+              <w:t>CURSO:</w:t>
+            </w:r>
+          </w:p>
+        </w:tc>
+        <w:tc>
+          <w:tcPr>
+            <w:tcW w:type="dxa" w:w="6236"/>
+          </w:tcPr>
+          <w:p>
+            <w:pPr>
+              <w:spacing w:after="40"/>
+            </w:pPr>
+            <w:r/>
+            <w:r>
+              <w:rPr>
+                <w:b w:val="0"/>
+                <w:sz w:val="20"/>
+              </w:rPr>
+              <w:t>CST EM ANÁLISE E DESENVOLVIMENTO DE SISTEMAS</w:t>
+            </w:r>
+          </w:p>
+        </w:tc>
+      </w:tr>
+      <w:tr>
+        <w:tc>
+          <w:tcPr>
+            <w:tcW w:type="dxa" w:w="2835"/>
+            <w:shd w:val="clear" w:color="auto" w:fill="D9D9D9"/>
+          </w:tcPr>
+          <w:p>
+            <w:pPr>
+              <w:spacing w:after="40"/>
+            </w:pPr>
+            <w:r/>
+            <w:r>
+              <w:rPr>
+                <w:b/>
+                <w:sz w:val="20"/>
+              </w:rPr>
+              <w:t>COMPONENTE CURRICULAR:</w:t>
+            </w:r>
+          </w:p>
+        </w:tc>
+        <w:tc>
+          <w:tcPr>
+            <w:tcW w:type="dxa" w:w="6236"/>
+          </w:tcPr>
+          <w:p>
+            <w:pPr>
+              <w:spacing w:after="40"/>
+            </w:pPr>
+            <w:r/>
+            <w:r>
+              <w:rPr>
+                <w:b w:val="0"/>
+                <w:sz w:val="20"/>
+              </w:rPr>
+              <w:t>PROJETO DE EXTENSÃO II - ANÁLISE E DESENVOLVIMENTO DE SISTEMAS</w:t>
+            </w:r>
+          </w:p>
+        </w:tc>
+      </w:tr>
+      <w:tr>
+        <w:tc>
+          <w:tcPr>
+            <w:tcW w:type="dxa" w:w="2835"/>
+            <w:shd w:val="clear" w:color="auto" w:fill="D9D9D9"/>
+          </w:tcPr>
+          <w:p>
+            <w:pPr>
+              <w:spacing w:after="40"/>
+            </w:pPr>
+            <w:r/>
+            <w:r>
+              <w:rPr>
+                <w:b/>
+                <w:sz w:val="20"/>
+              </w:rPr>
+              <w:t>PROGRAMA DE EXTENSÃO:</w:t>
+            </w:r>
+          </w:p>
+        </w:tc>
+        <w:tc>
+          <w:tcPr>
+            <w:tcW w:type="dxa" w:w="6236"/>
+          </w:tcPr>
+          <w:p>
+            <w:pPr>
+              <w:spacing w:after="40"/>
+            </w:pPr>
+            <w:r/>
+            <w:r>
+              <w:rPr>
+                <w:b w:val="0"/>
+                <w:sz w:val="20"/>
+              </w:rPr>
+              <w:t>PROGRAMA DE AÇÃO E DIFUSÃO CULTURAL.</w:t>
+            </w:r>
+          </w:p>
+        </w:tc>
+      </w:tr>
+      <w:tr>
+        <w:tc>
+          <w:tcPr>
+            <w:tcW w:type="dxa" w:w="2835"/>
+            <w:shd w:val="clear" w:color="auto" w:fill="D9D9D9"/>
+          </w:tcPr>
+          <w:p>
+            <w:pPr>
+              <w:spacing w:after="40"/>
+            </w:pPr>
+            <w:r/>
+            <w:r>
+              <w:rPr>
+                <w:b/>
+                <w:sz w:val="20"/>
+              </w:rPr>
+              <w:t>FINALIDADE E MOTIVAÇÃO:</w:t>
+            </w:r>
+          </w:p>
+        </w:tc>
+        <w:tc>
+          <w:tcPr>
+            <w:tcW w:type="dxa" w:w="6236"/>
+          </w:tcPr>
+          <w:p>
+            <w:pPr>
+              <w:spacing w:after="40"/>
+            </w:pPr>
+            <w:r/>
+            <w:r>
+              <w:rPr>
+                <w:b w:val="0"/>
+                <w:sz w:val="20"/>
+              </w:rPr>
+              <w:t>A extensão universitária voltada ao programa de ação e difusão cultural do Curso Superior de Tecnologia em Análise e Desenvolvimento de Sistemas, tem por finalidade utilizar os conhecimentos relacionados a tecnologia da informação para promover formas de auxiliar as pessoas ou grupos ligados à atividades culturais. Dessa forma, as atividades podem ser desenvolvidas em: secretaria da cultura, pinacotecas, teatros, grupos de artesanato, bandas, entre outros grupos ou locais relacionado à atividades culturais.</w:t>
+            </w:r>
+          </w:p>
+        </w:tc>
+      </w:tr>
+      <w:tr>
+        <w:tc>
+          <w:tcPr>
+            <w:tcW w:type="dxa" w:w="2835"/>
+            <w:shd w:val="clear" w:color="auto" w:fill="D9D9D9"/>
+          </w:tcPr>
+          <w:p>
+            <w:pPr>
+              <w:spacing w:after="40"/>
+            </w:pPr>
+            <w:r/>
+            <w:r>
+              <w:rPr>
+                <w:b/>
+                <w:sz w:val="20"/>
+              </w:rPr>
+              <w:t>COMPETÊNCIAS:</w:t>
+            </w:r>
+          </w:p>
+        </w:tc>
+        <w:tc>
+          <w:tcPr>
+            <w:tcW w:type="dxa" w:w="6236"/>
+          </w:tcPr>
+          <w:p>
+            <w:pPr>
+              <w:spacing w:after="40"/>
+            </w:pPr>
+            <w:r/>
+            <w:r>
+              <w:rPr>
+                <w:b w:val="0"/>
+                <w:sz w:val="20"/>
+              </w:rPr>
+              <w:t>I - Avaliar, selecionar e utilizar ferramentas, metodologias e tecnologias adequadas ao problema e ao contexto para a produção de sistemas computacionais;</w:t>
+            </w:r>
+          </w:p>
+          <w:p>
+            <w:pPr>
+              <w:spacing w:after="40"/>
+            </w:pPr>
+            <w:r>
+              <w:rPr>
+                <w:b w:val="0"/>
+                <w:sz w:val="20"/>
+              </w:rPr>
+              <w:t>II - Gerenciar projetos de software;</w:t>
+            </w:r>
+          </w:p>
+          <w:p>
+            <w:pPr>
+              <w:spacing w:after="40"/>
+            </w:pPr>
+            <w:r>
+              <w:rPr>
+                <w:b w:val="0"/>
+                <w:sz w:val="20"/>
+              </w:rPr>
+              <w:t>III - Especificar e gerenciar requisitos de software e o projeto de interfaces.</w:t>
+            </w:r>
+          </w:p>
+        </w:tc>
+      </w:tr>
+      <w:tr>
+        <w:tc>
+          <w:tcPr>
+            <w:tcW w:type="dxa" w:w="2835"/>
+            <w:shd w:val="clear" w:color="auto" w:fill="D9D9D9"/>
+          </w:tcPr>
+          <w:p>
+            <w:pPr>
+              <w:spacing w:after="40"/>
+            </w:pPr>
+            <w:r/>
+            <w:r>
+              <w:rPr>
+                <w:b/>
+                <w:sz w:val="20"/>
+              </w:rPr>
+              <w:t>PERFIL DO EGRESSO:</w:t>
+            </w:r>
+          </w:p>
+        </w:tc>
+        <w:tc>
+          <w:tcPr>
+            <w:tcW w:type="dxa" w:w="6236"/>
+          </w:tcPr>
+          <w:p>
+            <w:pPr>
+              <w:spacing w:after="40"/>
+            </w:pPr>
+            <w:r/>
+            <w:r>
+              <w:rPr>
+                <w:b w:val="0"/>
+                <w:sz w:val="20"/>
+              </w:rPr>
+              <w:t>No Curso Superior de Tecnologia em Análise e Desenvolvimento de Sistemas, o perfil do egresso visa uma formação profissional atualizado, criativo e atento as novas tendências e tecnologias. A atuação frente ao programa de ação e difusão cultural, demonstra as habilidades de comunicação interpessoal, resolução de problemas e flexibilidade, capaz de desenvolver soluções tecnologicas dentro dos princípios éticos. Tais atividades proporcionam além da compreensão de outros contextos social pelo contato com diferentes realidades e culturas, atuar de forma ativa na promoção das atividades de cunho artístico e cultural.</w:t>
+            </w:r>
+          </w:p>
+        </w:tc>
+      </w:tr>
+      <w:tr>
+        <w:tc>
+          <w:tcPr>
+            <w:tcW w:type="dxa" w:w="2835"/>
+            <w:shd w:val="clear" w:color="auto" w:fill="D9D9D9"/>
+          </w:tcPr>
+          <w:p>
+            <w:pPr>
+              <w:spacing w:after="40"/>
+            </w:pPr>
+            <w:r/>
+            <w:r>
+              <w:rPr>
+                <w:b/>
+                <w:sz w:val="20"/>
+              </w:rPr>
+              <w:t>SOFT SKILLS (COMPETÊNCIAS SOCIOEMOCIONAIS):</w:t>
+            </w:r>
+          </w:p>
+        </w:tc>
+        <w:tc>
+          <w:tcPr>
+            <w:tcW w:type="dxa" w:w="6236"/>
+          </w:tcPr>
+          <w:p>
+            <w:pPr>
+              <w:spacing w:after="40"/>
+            </w:pPr>
+            <w:r/>
+            <w:r>
+              <w:rPr>
+                <w:b w:val="0"/>
+                <w:sz w:val="20"/>
+              </w:rPr>
+              <w:t>Análise e resolução de problemas</w:t>
+            </w:r>
+          </w:p>
+          <w:p>
+            <w:pPr>
+              <w:spacing w:after="40"/>
+            </w:pPr>
+            <w:r>
+              <w:rPr>
+                <w:b w:val="0"/>
+                <w:sz w:val="20"/>
+              </w:rPr>
+              <w:t>Flexibilidade e adaptação</w:t>
+            </w:r>
+          </w:p>
+          <w:p>
+            <w:pPr>
+              <w:spacing w:after="40"/>
+            </w:pPr>
+            <w:r>
+              <w:rPr>
+                <w:b w:val="0"/>
+                <w:sz w:val="20"/>
+              </w:rPr>
+              <w:t>Comunicação Interpessoal</w:t>
+            </w:r>
+          </w:p>
+        </w:tc>
+      </w:tr>
+      <w:tr>
+        <w:tc>
+          <w:tcPr>
+            <w:tcW w:type="dxa" w:w="2835"/>
+            <w:shd w:val="clear" w:color="auto" w:fill="D9D9D9"/>
+          </w:tcPr>
+          <w:p>
+            <w:pPr>
+              <w:spacing w:after="40"/>
+            </w:pPr>
+            <w:r/>
+            <w:r>
+              <w:rPr>
+                <w:b/>
+                <w:sz w:val="20"/>
+              </w:rPr>
+              <w:t>OBJETIVOS DE APRENDIZAGEM:</w:t>
+            </w:r>
+          </w:p>
+        </w:tc>
+        <w:tc>
+          <w:tcPr>
+            <w:tcW w:type="dxa" w:w="6236"/>
+          </w:tcPr>
+          <w:p>
+            <w:pPr>
+              <w:spacing w:after="40"/>
+            </w:pPr>
+            <w:r/>
+            <w:r>
+              <w:rPr>
+                <w:b w:val="0"/>
+                <w:sz w:val="20"/>
+              </w:rPr>
+              <w:t>As ações de extensão do programa voltado a cultura no Curso Superior de Tecnologia em Análise e Desenvolvimento de Sistemas, tem como objetivo utilizar os conhecimentos técnicos relacionados a tecnologia da informação, a fim de auxiliar os profissionais relacionados a atividades culturais. Os desenvolvimentos, podem de alguma forma prover a divulgação de produtos ou serviços, auxiliar no planejamento, organização e gerenciamento das atividades, entre diversas outras possibilidades, desde que estejam relacionadas a cultura.</w:t>
+            </w:r>
+          </w:p>
+        </w:tc>
+      </w:tr>
+      <w:tr>
+        <w:tc>
+          <w:tcPr>
+            <w:tcW w:type="dxa" w:w="2835"/>
+            <w:shd w:val="clear" w:color="auto" w:fill="D9D9D9"/>
+          </w:tcPr>
+          <w:p>
+            <w:pPr>
+              <w:spacing w:after="40"/>
+            </w:pPr>
+            <w:r/>
+            <w:r>
+              <w:rPr>
+                <w:b/>
+                <w:sz w:val="20"/>
+              </w:rPr>
+              <w:t>CONTEÚDOS:</w:t>
+            </w:r>
+          </w:p>
+        </w:tc>
+        <w:tc>
+          <w:tcPr>
+            <w:tcW w:type="dxa" w:w="6236"/>
+          </w:tcPr>
+          <w:p>
+            <w:pPr>
+              <w:spacing w:after="40"/>
+            </w:pPr>
+            <w:r/>
+            <w:r>
+              <w:rPr>
+                <w:b w:val="0"/>
+                <w:sz w:val="20"/>
+              </w:rPr>
+              <w:t>I - Processo de software;</w:t>
+            </w:r>
+          </w:p>
+          <w:p>
+            <w:pPr>
+              <w:spacing w:after="40"/>
+            </w:pPr>
+            <w:r>
+              <w:rPr>
+                <w:b w:val="0"/>
+                <w:sz w:val="20"/>
+              </w:rPr>
+              <w:t>II - Análise e projeto de sistemas computacionais;</w:t>
+            </w:r>
+          </w:p>
+          <w:p>
+            <w:pPr>
+              <w:spacing w:after="40"/>
+            </w:pPr>
+            <w:r>
+              <w:rPr>
+                <w:b w:val="0"/>
+                <w:sz w:val="20"/>
+              </w:rPr>
+              <w:t>III - Engenharia de requisitos;</w:t>
+            </w:r>
+          </w:p>
+          <w:p>
+            <w:pPr>
+              <w:spacing w:after="40"/>
+            </w:pPr>
+            <w:r>
+              <w:rPr>
+                <w:b w:val="0"/>
+                <w:sz w:val="20"/>
+              </w:rPr>
+              <w:t>IV - Interação humano-computador;</w:t>
+            </w:r>
+          </w:p>
+          <w:p>
+            <w:pPr>
+              <w:spacing w:after="40"/>
+            </w:pPr>
+            <w:r>
+              <w:rPr>
+                <w:b w:val="0"/>
+                <w:sz w:val="20"/>
+              </w:rPr>
+              <w:t>V - Gerência de projetos;</w:t>
+            </w:r>
+          </w:p>
+          <w:p>
+            <w:pPr>
+              <w:spacing w:after="40"/>
+            </w:pPr>
+            <w:r>
+              <w:rPr>
+                <w:b w:val="0"/>
+                <w:sz w:val="20"/>
+              </w:rPr>
+              <w:t>VI - Processos de negócio.</w:t>
+            </w:r>
+          </w:p>
+        </w:tc>
+      </w:tr>
+      <w:tr>
+        <w:tc>
+          <w:tcPr>
+            <w:tcW w:type="dxa" w:w="2835"/>
+            <w:shd w:val="clear" w:color="auto" w:fill="D9D9D9"/>
+          </w:tcPr>
+          <w:p>
+            <w:pPr>
+              <w:spacing w:after="40"/>
+            </w:pPr>
+            <w:r/>
+            <w:r>
+              <w:rPr>
+                <w:b/>
+                <w:sz w:val="20"/>
+              </w:rPr>
+              <w:t>INDICAÇÕES BIBLIOGRÁFICAS:</w:t>
+            </w:r>
+          </w:p>
+        </w:tc>
+        <w:tc>
+          <w:tcPr>
+            <w:tcW w:type="dxa" w:w="6236"/>
+          </w:tcPr>
+          <w:p>
+            <w:pPr>
+              <w:spacing w:after="40"/>
+            </w:pPr>
+            <w:r/>
+            <w:r>
+              <w:rPr>
+                <w:b w:val="0"/>
+                <w:sz w:val="20"/>
+              </w:rPr>
+              <w:t>BENYON, David. Interação humano-computador. 2.ed. São Paulo: Pearson, 2011.</w:t>
+            </w:r>
+          </w:p>
+          <w:p>
+            <w:pPr>
+              <w:spacing w:after="40"/>
+            </w:pPr>
+            <w:r>
+              <w:rPr>
+                <w:b w:val="0"/>
+                <w:sz w:val="20"/>
+              </w:rPr>
+              <w:t>SEGURAGO, Valquíria Santos. Projeto de interface com o usuário. São Paulo: Pearson, 2017.</w:t>
+            </w:r>
+          </w:p>
+          <w:p>
+            <w:pPr>
+              <w:spacing w:after="40"/>
+            </w:pPr>
+            <w:r>
+              <w:rPr>
+                <w:b w:val="0"/>
+                <w:sz w:val="20"/>
+              </w:rPr>
+              <w:t>Camden, Raymond, and Matthews, Andy. jQuery Mobile Web Development Essentials. Olton: Packt Publishing, Limited, 2012.</w:t>
+            </w:r>
+          </w:p>
+        </w:tc>
+      </w:tr>
+    </w:tbl>
+    <w:p/>
     <w:p>
       <w:pPr>
-        <w:pStyle w:val="Title"/>
+        <w:jc w:val="center"/>
       </w:pPr>
       <w:r>
-        <w:t>RELATÓRIO FINAL — PROJETO DE EXTENSÃO II (ESTUDO DE CASO SIMULADO)</w:t>
+        <w:rPr>
+          <w:b/>
+          <w:sz w:val="28"/>
+        </w:rPr>
+        <w:t>RELATÓRIO FINAL:</w:t>
       </w:r>
     </w:p>
     <w:p>
+      <w:pPr>
+        <w:spacing w:after="120"/>
+      </w:pPr>
       <w:r>
         <w:rPr>
           <w:b w:val="0"/>
-          <w:sz w:val="22"/>
+          <w:sz w:val="20"/>
         </w:rPr>
-        <w:t>ALUNO: Luís Felipe de Oliveira Monteiro</w:t>
+        <w:t>Aluno e Aluna, após realizar suas atividades de extensão, é necessário que você o formalize, enviando esse Relatório Final para ser avaliado junto ao seu Ambiente Virtual (AVA) e também para você poder comprovar sua atuação. Para o preenchimento, busque as anotações junto ao TEMPLATE PCDA para auxiliar na apresentação das atividades desenvolvidas. Todos os campos são de preenchimento obrigatório!</w:t>
       </w:r>
     </w:p>
     <w:p>
+      <w:pPr>
+        <w:spacing w:after="120"/>
+      </w:pPr>
       <w:r>
         <w:rPr>
-          <w:b w:val="0"/>
-          <w:sz w:val="22"/>
+          <w:b/>
+          <w:sz w:val="20"/>
         </w:rPr>
-        <w:t>RA: 3823284706</w:t>
+        <w:t>Nota: conforme autorização do(a) tutor(a) do componente (mensagem no AVA em 04/10/2026), este trabalho foi desenvolvido como ESTUDO DE CASO SIMULADO. Parceiro, pessoas, entrevista, indicadores e cronograma são hipotéticos; não houve ação executada com instituição real e nenhum depoimento institucional é apresentado como verídico.</w:t>
       </w:r>
     </w:p>
     <w:p>
+      <w:pPr>
+        <w:spacing w:after="120"/>
+      </w:pPr>
       <w:r>
         <w:rPr>
-          <w:b w:val="0"/>
-          <w:sz w:val="22"/>
+          <w:b/>
+          <w:sz w:val="24"/>
         </w:rPr>
-        <w:t>POLO / UNIDADE: Polo Franca</w:t>
+        <w:t>DESCRIÇÃO DA AÇÃO COM RESULTADOS ALCANÇADOS</w:t>
       </w:r>
     </w:p>
     <w:p>
-      <w:r>
-        <w:rPr>
-          <w:b w:val="0"/>
-          <w:sz w:val="22"/>
-        </w:rPr>
-        <w:t>CURSO: CST EM ANÁLISE E DESENVOLVIMENTO DE SISTEMAS</w:t>
-      </w:r>
-    </w:p>
-    <w:p>
-      <w:r>
-        <w:rPr>
-          <w:b w:val="0"/>
-          <w:sz w:val="22"/>
-        </w:rPr>
-        <w:t>COMPONENTE CURRICULAR: PROJETO DE EXTENSÃO II - ANÁLISE E DESENVOLVIMENTO DE SISTEMAS</w:t>
-      </w:r>
-    </w:p>
-    <w:p>
-      <w:r>
-        <w:rPr>
-          <w:b w:val="0"/>
-          <w:sz w:val="22"/>
-        </w:rPr>
-        <w:t>PROGRAMA DE EXTENSÃO: PROGRAMA DE AÇÃO E DIFUSÃO CULTURAL.</w:t>
-      </w:r>
-    </w:p>
-    <w:p>
+      <w:pPr>
+        <w:spacing w:after="120"/>
+      </w:pPr>
       <w:r>
         <w:rPr>
           <w:b/>
           <w:sz w:val="22"/>
         </w:rPr>
-        <w:t>DECLARAÇÃO DE ESTUDO DE CASO SIMULADO: conforme autorização do(a) tutor(a) do componente, este trabalho foi desenvolvido como simulação didática. O parceiro, as pessoas, a entrevista, os indicadores e o cronograma descritos são hipotéticos e servem para exercitar as competências do componente (requisitos, interfaces, gerência de projetos). Não houve ação executada com instituição real, e nenhum depoimento institucional é apresentado como verídico.</w:t>
+        <w:t>Metas dos Objetivos de Desenvolvimento Sustentável (ODS) aderentes a este projeto:</w:t>
       </w:r>
     </w:p>
     <w:p>
       <w:pPr>
-        <w:pStyle w:val="Heading1"/>
+        <w:spacing w:after="120"/>
       </w:pPr>
-      <w:r>
-        <w:t>DESCRIÇÃO DA AÇÃO COM RESULTADOS ALCANÇADOS</w:t>
-      </w:r>
-    </w:p>
-    <w:p>
-      <w:pPr>
-        <w:pStyle w:val="Heading2"/>
-      </w:pPr>
-      <w:r>
-        <w:t>Metas dos Objetivos de Desenvolvimento Sustentável (ODS) aderentes a este projeto</w:t>
-      </w:r>
-    </w:p>
-    <w:p>
       <w:r>
         <w:rPr>
           <w:b w:val="0"/>
@@ -99,6 +750,9 @@
       </w:r>
     </w:p>
     <w:p>
+      <w:pPr>
+        <w:spacing w:after="120"/>
+      </w:pPr>
       <w:r>
         <w:rPr>
           <w:b w:val="0"/>
@@ -108,6 +762,9 @@
       </w:r>
     </w:p>
     <w:p>
+      <w:pPr>
+        <w:spacing w:after="120"/>
+      </w:pPr>
       <w:r>
         <w:rPr>
           <w:b w:val="0"/>
@@ -118,30 +775,44 @@
     </w:p>
     <w:p>
       <w:pPr>
-        <w:pStyle w:val="Heading2"/>
+        <w:spacing w:after="120"/>
       </w:pPr>
       <w:r>
-        <w:t>Local de realização da atividade extensionista</w:t>
+        <w:rPr>
+          <w:b/>
+          <w:sz w:val="22"/>
+        </w:rPr>
+        <w:t>Local de realização da atividade extensionista:</w:t>
       </w:r>
     </w:p>
     <w:p>
+      <w:pPr>
+        <w:spacing w:after="120"/>
+      </w:pPr>
       <w:r>
         <w:rPr>
           <w:b w:val="0"/>
           <w:sz w:val="22"/>
         </w:rPr>
-        <w:t>Estudo desenvolvido de forma remota pelo aluno, vinculado ao Polo Franca, em Franca/SP. O cenário simulado situa o parceiro hipotético (Coletivo Artesanal Couro &amp; Raízes) em ateliê de artesãos de couro e em feira cultural em espaço público municipal de Franca. Não houve deslocamento nem atividade presencial com instituição real.</w:t>
+        <w:t>Estudo desenvolvido de forma remota pelo aluno, vinculado ao Polo Franca, em Franca/SP. O cenário simulado situa o parceiro hipotético (Coletivo Artesanal Couro &amp; Raízes (parceiro fictício — estudo de caso simulado)) em ateliê de artesãos de couro e em feira cultural em espaço público municipal de Franca. Não houve deslocamento nem atividade presencial com instituição real.</w:t>
       </w:r>
     </w:p>
     <w:p>
       <w:pPr>
-        <w:pStyle w:val="Heading2"/>
+        <w:spacing w:after="120"/>
       </w:pPr>
       <w:r>
-        <w:t>Durante a ação</w:t>
+        <w:rPr>
+          <w:b/>
+          <w:sz w:val="22"/>
+        </w:rPr>
+        <w:t>Durante a ação:</w:t>
       </w:r>
     </w:p>
     <w:p>
+      <w:pPr>
+        <w:spacing w:after="120"/>
+      </w:pPr>
       <w:r>
         <w:rPr>
           <w:b w:val="0"/>
@@ -151,50 +822,33 @@
       </w:r>
     </w:p>
     <w:p>
+      <w:pPr>
+        <w:spacing w:after="120"/>
+      </w:pPr>
       <w:r>
         <w:rPr>
           <w:b w:val="0"/>
           <w:sz w:val="22"/>
         </w:rPr>
-        <w:t>PER. 1: construção do cenário, aplicação do roteiro de imersão e requisitos v1.0.</w:t>
-      </w:r>
-    </w:p>
-    <w:p>
-      <w:r>
-        <w:rPr>
-          <w:b w:val="0"/>
-          <w:sz w:val="22"/>
-        </w:rPr>
-        <w:t>PER. 2: benchmark de páginas de feiras culturais, escolha da alternativa landing + Forms, wireframes e protótipo.</w:t>
-      </w:r>
-    </w:p>
-    <w:p>
-      <w:r>
-        <w:rPr>
-          <w:b w:val="0"/>
-          <w:sz w:val="22"/>
-        </w:rPr>
-        <w:t>PER. 3: estrutura da página, modelo do formulário e checklist de testes (responsividade, contraste, LGPD).</w:t>
-      </w:r>
-    </w:p>
-    <w:p>
-      <w:r>
-        <w:rPr>
-          <w:b w:val="0"/>
-          <w:sz w:val="22"/>
-        </w:rPr>
-        <w:t>PER. 4: manual do gestor, roteiro da capacitação, consolidação do PDCA e deste relatório.</w:t>
+        <w:t>PER. 1: construção do cenário, aplicação do roteiro de imersão e requisitos v1.0. PER. 2: benchmark de páginas de feiras culturais, escolha da alternativa landing + Forms, wireframes e protótipo. PER. 3: estrutura da página, modelo do formulário e checklist de testes (responsividade, contraste, LGPD). PER. 4: manual do gestor, roteiro da capacitação, consolidação do PDCA e deste relatório.</w:t>
       </w:r>
     </w:p>
     <w:p>
       <w:pPr>
-        <w:pStyle w:val="Heading2"/>
+        <w:spacing w:after="120"/>
       </w:pPr>
       <w:r>
-        <w:t>Caso necessário, houve mudança de estratégia para alcançar o resultado</w:t>
+        <w:rPr>
+          <w:b/>
+          <w:sz w:val="22"/>
+        </w:rPr>
+        <w:t>Caso necessário, houve mudança de estratégia para alcançar o resultado:</w:t>
       </w:r>
     </w:p>
     <w:p>
+      <w:pPr>
+        <w:spacing w:after="120"/>
+      </w:pPr>
       <w:r>
         <w:rPr>
           <w:b w:val="0"/>
@@ -205,30 +859,56 @@
     </w:p>
     <w:p>
       <w:pPr>
-        <w:pStyle w:val="Heading2"/>
+        <w:spacing w:after="120"/>
       </w:pPr>
       <w:r>
-        <w:t>Resultado da ação</w:t>
+        <w:rPr>
+          <w:b/>
+          <w:sz w:val="22"/>
+        </w:rPr>
+        <w:t>Resultado da ação:</w:t>
       </w:r>
     </w:p>
     <w:p>
+      <w:pPr>
+        <w:spacing w:after="120"/>
+      </w:pPr>
       <w:r>
         <w:rPr>
           <w:b w:val="0"/>
           <w:sz w:val="22"/>
         </w:rPr>
-        <w:t>Artefatos produzidos: documento de requisitos com 10 RF e 5 RNF (ex.: RF01 – exibir data, local e mapa da próxima feira; RF04 – inscrição de expositor com termo de consentimento; RF07 – galeria de peças em couro; RNF01 – layout responsivo; RNF03 – contraste mínimo WCAG AA; RNF04 – respostas acessíveis apenas aos coordenadores); wireframes e protótipo Figma com três telas; estrutura da landing page e modelo do formulário de inscrição com termo de consentimento; manual do gestor; roteiro de oficina; cronograma em quatro períodos e ciclo PDCA completo. Indicadores projetados para uma execução real: canal único de informação ativo; meta de 12 inscrições organizadas por feira (contra ~6 em papel no cenário); meta de 500 visualizações no primeiro mês; 2 coordenadores capacitados. Não há resultados de campo, pois a ação não foi executada com parceiro real.</w:t>
+        <w:t>Artefatos produzidos: documento de requisitos com 10 RF e 5 RNF (ex.: RF01 – exibir data, local e mapa da próxima feira; RF04 – inscrição de expositor com termo de consentimento; RF07 – galeria de peças em couro; RNF01 – layout responsivo; RNF03 – contraste mínimo WCAG AA; RNF04 – respostas acessíveis apenas aos coordenadores); wireframes e protótipo Figma com três telas; estrutura da landing page e modelo do formulário de inscrição com termo de consentimento; manual do gestor; roteiro de oficina; cronograma em quatro períodos e ciclo PDCA completo.</w:t>
       </w:r>
     </w:p>
     <w:p>
       <w:pPr>
-        <w:pStyle w:val="Heading2"/>
+        <w:spacing w:after="120"/>
       </w:pPr>
       <w:r>
-        <w:t>Conclusão</w:t>
+        <w:rPr>
+          <w:b w:val="0"/>
+          <w:sz w:val="22"/>
+        </w:rPr>
+        <w:t>Indicadores projetados para uma execução real: canal único de informação ativo; meta de 12 inscrições organizadas por feira (contra ~6 em papel no cenário); meta de 500 visualizações no primeiro mês; 2 coordenadores capacitados. Não há resultados de campo, pois a ação não foi executada com parceiro real.</w:t>
       </w:r>
     </w:p>
     <w:p>
+      <w:pPr>
+        <w:spacing w:after="120"/>
+      </w:pPr>
+      <w:r>
+        <w:rPr>
+          <w:b/>
+          <w:sz w:val="22"/>
+        </w:rPr>
+        <w:t>Conclusão:</w:t>
+      </w:r>
+    </w:p>
+    <w:p>
+      <w:pPr>
+        <w:spacing w:after="120"/>
+      </w:pPr>
       <w:r>
         <w:rPr>
           <w:b w:val="0"/>
@@ -239,13 +919,20 @@
     </w:p>
     <w:p>
       <w:pPr>
-        <w:pStyle w:val="Heading2"/>
+        <w:spacing w:after="120"/>
       </w:pPr>
       <w:r>
-        <w:t>Depoimentos (se houver)</w:t>
+        <w:rPr>
+          <w:b/>
+          <w:sz w:val="22"/>
+        </w:rPr>
+        <w:t>Depoimentos (se houver):</w:t>
       </w:r>
     </w:p>
     <w:p>
+      <w:pPr>
+        <w:spacing w:after="120"/>
+      </w:pPr>
       <w:r>
         <w:rPr>
           <w:b w:val="0"/>
@@ -256,13 +943,20 @@
     </w:p>
     <w:p>
       <w:pPr>
-        <w:pStyle w:val="Heading1"/>
+        <w:spacing w:after="120"/>
       </w:pPr>
       <w:r>
-        <w:t>RELATE SUA PERCEPÇÃO DAS AÇÕES EXTENSIONISTAS (mínimo 15 linhas)</w:t>
+        <w:rPr>
+          <w:b/>
+          <w:sz w:val="24"/>
+        </w:rPr>
+        <w:t>RELATE SUA PERCEPÇÃO DAS AÇÕES EXTENSIONISTAS REALIZADAS NO PROGRAMA DESENVOLVIDO:</w:t>
       </w:r>
     </w:p>
     <w:p>
+      <w:pPr>
+        <w:spacing w:after="120"/>
+      </w:pPr>
       <w:r>
         <w:rPr>
           <w:b w:val="0"/>
@@ -272,6 +966,9 @@
       </w:r>
     </w:p>
     <w:p>
+      <w:pPr>
+        <w:spacing w:after="120"/>
+      </w:pPr>
       <w:r>
         <w:rPr>
           <w:b w:val="0"/>
@@ -281,6 +978,9 @@
       </w:r>
     </w:p>
     <w:p>
+      <w:pPr>
+        <w:spacing w:after="120"/>
+      </w:pPr>
       <w:r>
         <w:rPr>
           <w:b w:val="0"/>
@@ -290,6 +990,9 @@
       </w:r>
     </w:p>
     <w:p>
+      <w:pPr>
+        <w:spacing w:after="120"/>
+      </w:pPr>
       <w:r>
         <w:rPr>
           <w:b w:val="0"/>
@@ -300,161 +1003,2960 @@
     </w:p>
     <w:p>
       <w:pPr>
-        <w:pStyle w:val="Heading1"/>
+        <w:spacing w:after="120"/>
       </w:pPr>
       <w:r>
+        <w:rPr>
+          <w:b/>
+          <w:sz w:val="24"/>
+        </w:rPr>
         <w:t>DEPOIMENTO DA INSTITUIÇÃO PARTICIPANTE</w:t>
       </w:r>
     </w:p>
     <w:p>
+      <w:pPr>
+        <w:spacing w:after="120"/>
+      </w:pPr>
       <w:r>
         <w:rPr>
           <w:b w:val="0"/>
           <w:sz w:val="22"/>
         </w:rPr>
-        <w:t>Não se aplica. Este trabalho é um estudo de caso simulado, autorizado pelo(a) tutor(a) do componente, sem participação de instituição real. Em uma execução futura, o depoimento será coletado com o(a) coordenador(a) do parceiro, identificando nome, função, contato e data, e anexado ao AVA com o termo de parceria.</w:t>
-      </w:r>
-    </w:p>
-    <w:p>
-      <w:r>
-        <w:rPr>
-          <w:b w:val="0"/>
-          <w:sz w:val="22"/>
-        </w:rPr>
-        <w:t>Registro da autorização: concedida pelo(a) tutor(a) do componente por mensagem no AVA, em 04/10/2026.</w:t>
+        <w:t>Não se aplica. Este trabalho é um estudo de caso simulado, autorizado pelo(a) tutor(a) do componente por mensagem no AVA em 04/10/2026, sem participação de instituição real. Em uma execução futura, o depoimento será coletado com o(a) coordenador(a) do parceiro, identificando nome, função, contato e data, e anexado ao AVA com o termo de parceria.</w:t>
       </w:r>
     </w:p>
     <w:p>
       <w:pPr>
-        <w:pStyle w:val="Heading1"/>
+        <w:spacing w:after="120"/>
       </w:pPr>
       <w:r>
-        <w:t>REFERÊNCIAS BIBLIOGRÁFICAS (ABNT)</w:t>
+        <w:rPr>
+          <w:b/>
+          <w:sz w:val="24"/>
+        </w:rPr>
+        <w:t>REFERÊNCIAS BIBLIOGRÁFICAS</w:t>
       </w:r>
     </w:p>
     <w:p>
+      <w:pPr>
+        <w:spacing w:after="120"/>
+      </w:pPr>
       <w:r>
         <w:rPr>
           <w:b w:val="0"/>
-          <w:sz w:val="22"/>
+          <w:sz w:val="20"/>
         </w:rPr>
         <w:t>BENYON, David. Interação humano-computador. 2. ed. São Paulo: Pearson, 2011.</w:t>
       </w:r>
     </w:p>
     <w:p>
+      <w:pPr>
+        <w:spacing w:after="120"/>
+      </w:pPr>
       <w:r>
         <w:rPr>
           <w:b w:val="0"/>
-          <w:sz w:val="22"/>
+          <w:sz w:val="20"/>
         </w:rPr>
         <w:t>BRASIL. Lei nº 13.709, de 14 de agosto de 2018. Lei Geral de Proteção de Dados Pessoais (LGPD). Diário Oficial da União: seção 1, Brasília, DF, 15 ago. 2018. Disponível em: https://www.planalto.gov.br/ccivil_03/_ato2015-2018/2018/lei/l13709.htm. Acesso em: 28 set. 2026.</w:t>
       </w:r>
     </w:p>
     <w:p>
+      <w:pPr>
+        <w:spacing w:after="120"/>
+      </w:pPr>
       <w:r>
         <w:rPr>
           <w:b w:val="0"/>
-          <w:sz w:val="22"/>
+          <w:sz w:val="20"/>
         </w:rPr>
         <w:t>CAMDEN, Raymond; MATTHEWS, Andy. jQuery Mobile Web Development Essentials. Olton: Packt Publishing, 2012.</w:t>
       </w:r>
     </w:p>
     <w:p>
+      <w:pPr>
+        <w:spacing w:after="120"/>
+      </w:pPr>
       <w:r>
         <w:rPr>
           <w:b w:val="0"/>
-          <w:sz w:val="22"/>
+          <w:sz w:val="20"/>
         </w:rPr>
         <w:t>ONU — ORGANIZAÇÃO DAS NAÇÕES UNIDAS. Transformando nosso mundo: a Agenda 2030 para o Desenvolvimento Sustentável. Nova York: ONU, 2015. Disponível em: https://brasil.un.org/sites/default/files/2020-09/agenda2030-pt-br.pdf. Acesso em: 28 set. 2026.</w:t>
       </w:r>
     </w:p>
     <w:p>
+      <w:pPr>
+        <w:spacing w:after="120"/>
+      </w:pPr>
       <w:r>
         <w:rPr>
           <w:b w:val="0"/>
-          <w:sz w:val="22"/>
+          <w:sz w:val="20"/>
         </w:rPr>
         <w:t>PRESSMAN, Roger S.; MAXIM, Bruce R. Engenharia de software: uma abordagem profissional. 8. ed. Porto Alegre: AMGH, 2016.</w:t>
       </w:r>
     </w:p>
     <w:p>
+      <w:pPr>
+        <w:spacing w:after="120"/>
+      </w:pPr>
       <w:r>
         <w:rPr>
           <w:b w:val="0"/>
-          <w:sz w:val="22"/>
+          <w:sz w:val="20"/>
         </w:rPr>
         <w:t>SEGURAGO, Valquíria Santos. Projeto de interface com o usuário. São Paulo: Pearson, 2017.</w:t>
       </w:r>
     </w:p>
     <w:p>
       <w:pPr>
-        <w:pStyle w:val="Heading1"/>
+        <w:spacing w:after="120"/>
       </w:pPr>
       <w:r>
-        <w:t>AUTOAVALIAÇÃO DA ATIVIDADE (escala de 0 a 10)</w:t>
+        <w:rPr>
+          <w:b/>
+          <w:sz w:val="24"/>
+        </w:rPr>
+        <w:t>AUTOAVALIAÇÃO DA ATIVIDADE:</w:t>
       </w:r>
     </w:p>
     <w:p>
+      <w:pPr>
+        <w:spacing w:after="120"/>
+      </w:pPr>
+      <w:r>
+        <w:rPr>
+          <w:b w:val="0"/>
+          <w:sz w:val="20"/>
+        </w:rPr>
+        <w:t>Realize a sua avaliação em relação à atividade desenvolvida considerando uma escala de 0 a 10 para cada pergunta, assinalando com um X:</w:t>
+      </w:r>
+    </w:p>
+    <w:p>
+      <w:pPr>
+        <w:spacing w:after="120"/>
+      </w:pPr>
+      <w:r>
+        <w:rPr>
+          <w:b/>
+          <w:sz w:val="20"/>
+        </w:rPr>
+        <w:t>1. A atividade permitiu o desenvolvimento do projeto de extensão articulando as competências e conteúdos propostos junto ao Curso?</w:t>
+      </w:r>
+    </w:p>
+    <w:tbl>
+      <w:tblPr>
+        <w:tblStyle w:val="TableGrid"/>
+        <w:tblW w:type="auto" w:w="0"/>
+        <w:jc w:val="center"/>
+        <w:tblLook w:firstColumn="1" w:firstRow="1" w:lastColumn="0" w:lastRow="0" w:noHBand="0" w:noVBand="1" w:val="04A0"/>
+      </w:tblPr>
+      <w:tblGrid>
+        <w:gridCol w:w="825"/>
+        <w:gridCol w:w="825"/>
+        <w:gridCol w:w="825"/>
+        <w:gridCol w:w="825"/>
+        <w:gridCol w:w="825"/>
+        <w:gridCol w:w="825"/>
+        <w:gridCol w:w="825"/>
+        <w:gridCol w:w="825"/>
+        <w:gridCol w:w="825"/>
+        <w:gridCol w:w="825"/>
+        <w:gridCol w:w="825"/>
+      </w:tblGrid>
+      <w:tr>
+        <w:tc>
+          <w:tcPr>
+            <w:tcW w:type="dxa" w:w="825"/>
+            <w:shd w:val="clear" w:color="auto" w:fill="D9D9D9"/>
+          </w:tcPr>
+          <w:p>
+            <w:pPr>
+              <w:spacing w:after="40"/>
+              <w:jc w:val="center"/>
+            </w:pPr>
+            <w:r/>
+            <w:r>
+              <w:rPr>
+                <w:b/>
+                <w:sz w:val="20"/>
+              </w:rPr>
+              <w:t>0</w:t>
+            </w:r>
+          </w:p>
+        </w:tc>
+        <w:tc>
+          <w:tcPr>
+            <w:tcW w:type="dxa" w:w="825"/>
+            <w:shd w:val="clear" w:color="auto" w:fill="D9D9D9"/>
+          </w:tcPr>
+          <w:p>
+            <w:pPr>
+              <w:spacing w:after="40"/>
+              <w:jc w:val="center"/>
+            </w:pPr>
+            <w:r/>
+            <w:r>
+              <w:rPr>
+                <w:b/>
+                <w:sz w:val="20"/>
+              </w:rPr>
+              <w:t>1</w:t>
+            </w:r>
+          </w:p>
+        </w:tc>
+        <w:tc>
+          <w:tcPr>
+            <w:tcW w:type="dxa" w:w="825"/>
+            <w:shd w:val="clear" w:color="auto" w:fill="D9D9D9"/>
+          </w:tcPr>
+          <w:p>
+            <w:pPr>
+              <w:spacing w:after="40"/>
+              <w:jc w:val="center"/>
+            </w:pPr>
+            <w:r/>
+            <w:r>
+              <w:rPr>
+                <w:b/>
+                <w:sz w:val="20"/>
+              </w:rPr>
+              <w:t>2</w:t>
+            </w:r>
+          </w:p>
+        </w:tc>
+        <w:tc>
+          <w:tcPr>
+            <w:tcW w:type="dxa" w:w="825"/>
+            <w:shd w:val="clear" w:color="auto" w:fill="D9D9D9"/>
+          </w:tcPr>
+          <w:p>
+            <w:pPr>
+              <w:spacing w:after="40"/>
+              <w:jc w:val="center"/>
+            </w:pPr>
+            <w:r/>
+            <w:r>
+              <w:rPr>
+                <w:b/>
+                <w:sz w:val="20"/>
+              </w:rPr>
+              <w:t>3</w:t>
+            </w:r>
+          </w:p>
+        </w:tc>
+        <w:tc>
+          <w:tcPr>
+            <w:tcW w:type="dxa" w:w="825"/>
+            <w:shd w:val="clear" w:color="auto" w:fill="D9D9D9"/>
+          </w:tcPr>
+          <w:p>
+            <w:pPr>
+              <w:spacing w:after="40"/>
+              <w:jc w:val="center"/>
+            </w:pPr>
+            <w:r/>
+            <w:r>
+              <w:rPr>
+                <w:b/>
+                <w:sz w:val="20"/>
+              </w:rPr>
+              <w:t>4</w:t>
+            </w:r>
+          </w:p>
+        </w:tc>
+        <w:tc>
+          <w:tcPr>
+            <w:tcW w:type="dxa" w:w="825"/>
+            <w:shd w:val="clear" w:color="auto" w:fill="D9D9D9"/>
+          </w:tcPr>
+          <w:p>
+            <w:pPr>
+              <w:spacing w:after="40"/>
+              <w:jc w:val="center"/>
+            </w:pPr>
+            <w:r/>
+            <w:r>
+              <w:rPr>
+                <w:b/>
+                <w:sz w:val="20"/>
+              </w:rPr>
+              <w:t>5</w:t>
+            </w:r>
+          </w:p>
+        </w:tc>
+        <w:tc>
+          <w:tcPr>
+            <w:tcW w:type="dxa" w:w="825"/>
+            <w:shd w:val="clear" w:color="auto" w:fill="D9D9D9"/>
+          </w:tcPr>
+          <w:p>
+            <w:pPr>
+              <w:spacing w:after="40"/>
+              <w:jc w:val="center"/>
+            </w:pPr>
+            <w:r/>
+            <w:r>
+              <w:rPr>
+                <w:b/>
+                <w:sz w:val="20"/>
+              </w:rPr>
+              <w:t>6</w:t>
+            </w:r>
+          </w:p>
+        </w:tc>
+        <w:tc>
+          <w:tcPr>
+            <w:tcW w:type="dxa" w:w="825"/>
+            <w:shd w:val="clear" w:color="auto" w:fill="D9D9D9"/>
+          </w:tcPr>
+          <w:p>
+            <w:pPr>
+              <w:spacing w:after="40"/>
+              <w:jc w:val="center"/>
+            </w:pPr>
+            <w:r/>
+            <w:r>
+              <w:rPr>
+                <w:b/>
+                <w:sz w:val="20"/>
+              </w:rPr>
+              <w:t>7</w:t>
+            </w:r>
+          </w:p>
+        </w:tc>
+        <w:tc>
+          <w:tcPr>
+            <w:tcW w:type="dxa" w:w="825"/>
+            <w:shd w:val="clear" w:color="auto" w:fill="D9D9D9"/>
+          </w:tcPr>
+          <w:p>
+            <w:pPr>
+              <w:spacing w:after="40"/>
+              <w:jc w:val="center"/>
+            </w:pPr>
+            <w:r/>
+            <w:r>
+              <w:rPr>
+                <w:b/>
+                <w:sz w:val="20"/>
+              </w:rPr>
+              <w:t>8</w:t>
+            </w:r>
+          </w:p>
+        </w:tc>
+        <w:tc>
+          <w:tcPr>
+            <w:tcW w:type="dxa" w:w="825"/>
+            <w:shd w:val="clear" w:color="auto" w:fill="D9D9D9"/>
+          </w:tcPr>
+          <w:p>
+            <w:pPr>
+              <w:spacing w:after="40"/>
+              <w:jc w:val="center"/>
+            </w:pPr>
+            <w:r/>
+            <w:r>
+              <w:rPr>
+                <w:b/>
+                <w:sz w:val="20"/>
+              </w:rPr>
+              <w:t>9</w:t>
+            </w:r>
+          </w:p>
+        </w:tc>
+        <w:tc>
+          <w:tcPr>
+            <w:tcW w:type="dxa" w:w="825"/>
+            <w:shd w:val="clear" w:color="auto" w:fill="D9D9D9"/>
+          </w:tcPr>
+          <w:p>
+            <w:pPr>
+              <w:spacing w:after="40"/>
+              <w:jc w:val="center"/>
+            </w:pPr>
+            <w:r/>
+            <w:r>
+              <w:rPr>
+                <w:b/>
+                <w:sz w:val="20"/>
+              </w:rPr>
+              <w:t>10</w:t>
+            </w:r>
+          </w:p>
+        </w:tc>
+      </w:tr>
+      <w:tr>
+        <w:tc>
+          <w:tcPr>
+            <w:tcW w:type="dxa" w:w="825"/>
+          </w:tcPr>
+          <w:p>
+            <w:pPr>
+              <w:spacing w:after="40"/>
+              <w:jc w:val="center"/>
+            </w:pPr>
+            <w:r/>
+            <w:r>
+              <w:rPr>
+                <w:b w:val="0"/>
+                <w:sz w:val="20"/>
+              </w:rPr>
+              <w:t>( )</w:t>
+            </w:r>
+          </w:p>
+        </w:tc>
+        <w:tc>
+          <w:tcPr>
+            <w:tcW w:type="dxa" w:w="825"/>
+          </w:tcPr>
+          <w:p>
+            <w:pPr>
+              <w:spacing w:after="40"/>
+              <w:jc w:val="center"/>
+            </w:pPr>
+            <w:r/>
+            <w:r>
+              <w:rPr>
+                <w:b w:val="0"/>
+                <w:sz w:val="20"/>
+              </w:rPr>
+              <w:t>( )</w:t>
+            </w:r>
+          </w:p>
+        </w:tc>
+        <w:tc>
+          <w:tcPr>
+            <w:tcW w:type="dxa" w:w="825"/>
+          </w:tcPr>
+          <w:p>
+            <w:pPr>
+              <w:spacing w:after="40"/>
+              <w:jc w:val="center"/>
+            </w:pPr>
+            <w:r/>
+            <w:r>
+              <w:rPr>
+                <w:b w:val="0"/>
+                <w:sz w:val="20"/>
+              </w:rPr>
+              <w:t>( )</w:t>
+            </w:r>
+          </w:p>
+        </w:tc>
+        <w:tc>
+          <w:tcPr>
+            <w:tcW w:type="dxa" w:w="825"/>
+          </w:tcPr>
+          <w:p>
+            <w:pPr>
+              <w:spacing w:after="40"/>
+              <w:jc w:val="center"/>
+            </w:pPr>
+            <w:r/>
+            <w:r>
+              <w:rPr>
+                <w:b w:val="0"/>
+                <w:sz w:val="20"/>
+              </w:rPr>
+              <w:t>( )</w:t>
+            </w:r>
+          </w:p>
+        </w:tc>
+        <w:tc>
+          <w:tcPr>
+            <w:tcW w:type="dxa" w:w="825"/>
+          </w:tcPr>
+          <w:p>
+            <w:pPr>
+              <w:spacing w:after="40"/>
+              <w:jc w:val="center"/>
+            </w:pPr>
+            <w:r/>
+            <w:r>
+              <w:rPr>
+                <w:b w:val="0"/>
+                <w:sz w:val="20"/>
+              </w:rPr>
+              <w:t>( )</w:t>
+            </w:r>
+          </w:p>
+        </w:tc>
+        <w:tc>
+          <w:tcPr>
+            <w:tcW w:type="dxa" w:w="825"/>
+          </w:tcPr>
+          <w:p>
+            <w:pPr>
+              <w:spacing w:after="40"/>
+              <w:jc w:val="center"/>
+            </w:pPr>
+            <w:r/>
+            <w:r>
+              <w:rPr>
+                <w:b w:val="0"/>
+                <w:sz w:val="20"/>
+              </w:rPr>
+              <w:t>( )</w:t>
+            </w:r>
+          </w:p>
+        </w:tc>
+        <w:tc>
+          <w:tcPr>
+            <w:tcW w:type="dxa" w:w="825"/>
+          </w:tcPr>
+          <w:p>
+            <w:pPr>
+              <w:spacing w:after="40"/>
+              <w:jc w:val="center"/>
+            </w:pPr>
+            <w:r/>
+            <w:r>
+              <w:rPr>
+                <w:b w:val="0"/>
+                <w:sz w:val="20"/>
+              </w:rPr>
+              <w:t>( )</w:t>
+            </w:r>
+          </w:p>
+        </w:tc>
+        <w:tc>
+          <w:tcPr>
+            <w:tcW w:type="dxa" w:w="825"/>
+          </w:tcPr>
+          <w:p>
+            <w:pPr>
+              <w:spacing w:after="40"/>
+              <w:jc w:val="center"/>
+            </w:pPr>
+            <w:r/>
+            <w:r>
+              <w:rPr>
+                <w:b w:val="0"/>
+                <w:sz w:val="20"/>
+              </w:rPr>
+              <w:t>( )</w:t>
+            </w:r>
+          </w:p>
+        </w:tc>
+        <w:tc>
+          <w:tcPr>
+            <w:tcW w:type="dxa" w:w="825"/>
+          </w:tcPr>
+          <w:p>
+            <w:pPr>
+              <w:spacing w:after="40"/>
+              <w:jc w:val="center"/>
+            </w:pPr>
+            <w:r/>
+            <w:r>
+              <w:rPr>
+                <w:b w:val="0"/>
+                <w:sz w:val="20"/>
+              </w:rPr>
+              <w:t>( )</w:t>
+            </w:r>
+          </w:p>
+        </w:tc>
+        <w:tc>
+          <w:tcPr>
+            <w:tcW w:type="dxa" w:w="825"/>
+          </w:tcPr>
+          <w:p>
+            <w:pPr>
+              <w:spacing w:after="40"/>
+              <w:jc w:val="center"/>
+            </w:pPr>
+            <w:r/>
+            <w:r>
+              <w:rPr>
+                <w:b w:val="0"/>
+                <w:sz w:val="20"/>
+              </w:rPr>
+              <w:t>(X)</w:t>
+            </w:r>
+          </w:p>
+        </w:tc>
+        <w:tc>
+          <w:tcPr>
+            <w:tcW w:type="dxa" w:w="825"/>
+          </w:tcPr>
+          <w:p>
+            <w:pPr>
+              <w:spacing w:after="40"/>
+              <w:jc w:val="center"/>
+            </w:pPr>
+            <w:r/>
+            <w:r>
+              <w:rPr>
+                <w:b w:val="0"/>
+                <w:sz w:val="20"/>
+              </w:rPr>
+              <w:t>( )</w:t>
+            </w:r>
+          </w:p>
+        </w:tc>
+      </w:tr>
+    </w:tbl>
+    <w:p/>
+    <w:p>
+      <w:pPr>
+        <w:spacing w:after="120"/>
+      </w:pPr>
+      <w:r>
+        <w:rPr>
+          <w:b/>
+          <w:sz w:val="20"/>
+        </w:rPr>
+        <w:t>2. A atividade possui carga horária suficiente para a sua realização?</w:t>
+      </w:r>
+    </w:p>
+    <w:tbl>
+      <w:tblPr>
+        <w:tblStyle w:val="TableGrid"/>
+        <w:tblW w:type="auto" w:w="0"/>
+        <w:jc w:val="center"/>
+        <w:tblLook w:firstColumn="1" w:firstRow="1" w:lastColumn="0" w:lastRow="0" w:noHBand="0" w:noVBand="1" w:val="04A0"/>
+      </w:tblPr>
+      <w:tblGrid>
+        <w:gridCol w:w="825"/>
+        <w:gridCol w:w="825"/>
+        <w:gridCol w:w="825"/>
+        <w:gridCol w:w="825"/>
+        <w:gridCol w:w="825"/>
+        <w:gridCol w:w="825"/>
+        <w:gridCol w:w="825"/>
+        <w:gridCol w:w="825"/>
+        <w:gridCol w:w="825"/>
+        <w:gridCol w:w="825"/>
+        <w:gridCol w:w="825"/>
+      </w:tblGrid>
+      <w:tr>
+        <w:tc>
+          <w:tcPr>
+            <w:tcW w:type="dxa" w:w="825"/>
+            <w:shd w:val="clear" w:color="auto" w:fill="D9D9D9"/>
+          </w:tcPr>
+          <w:p>
+            <w:pPr>
+              <w:spacing w:after="40"/>
+              <w:jc w:val="center"/>
+            </w:pPr>
+            <w:r/>
+            <w:r>
+              <w:rPr>
+                <w:b/>
+                <w:sz w:val="20"/>
+              </w:rPr>
+              <w:t>0</w:t>
+            </w:r>
+          </w:p>
+        </w:tc>
+        <w:tc>
+          <w:tcPr>
+            <w:tcW w:type="dxa" w:w="825"/>
+            <w:shd w:val="clear" w:color="auto" w:fill="D9D9D9"/>
+          </w:tcPr>
+          <w:p>
+            <w:pPr>
+              <w:spacing w:after="40"/>
+              <w:jc w:val="center"/>
+            </w:pPr>
+            <w:r/>
+            <w:r>
+              <w:rPr>
+                <w:b/>
+                <w:sz w:val="20"/>
+              </w:rPr>
+              <w:t>1</w:t>
+            </w:r>
+          </w:p>
+        </w:tc>
+        <w:tc>
+          <w:tcPr>
+            <w:tcW w:type="dxa" w:w="825"/>
+            <w:shd w:val="clear" w:color="auto" w:fill="D9D9D9"/>
+          </w:tcPr>
+          <w:p>
+            <w:pPr>
+              <w:spacing w:after="40"/>
+              <w:jc w:val="center"/>
+            </w:pPr>
+            <w:r/>
+            <w:r>
+              <w:rPr>
+                <w:b/>
+                <w:sz w:val="20"/>
+              </w:rPr>
+              <w:t>2</w:t>
+            </w:r>
+          </w:p>
+        </w:tc>
+        <w:tc>
+          <w:tcPr>
+            <w:tcW w:type="dxa" w:w="825"/>
+            <w:shd w:val="clear" w:color="auto" w:fill="D9D9D9"/>
+          </w:tcPr>
+          <w:p>
+            <w:pPr>
+              <w:spacing w:after="40"/>
+              <w:jc w:val="center"/>
+            </w:pPr>
+            <w:r/>
+            <w:r>
+              <w:rPr>
+                <w:b/>
+                <w:sz w:val="20"/>
+              </w:rPr>
+              <w:t>3</w:t>
+            </w:r>
+          </w:p>
+        </w:tc>
+        <w:tc>
+          <w:tcPr>
+            <w:tcW w:type="dxa" w:w="825"/>
+            <w:shd w:val="clear" w:color="auto" w:fill="D9D9D9"/>
+          </w:tcPr>
+          <w:p>
+            <w:pPr>
+              <w:spacing w:after="40"/>
+              <w:jc w:val="center"/>
+            </w:pPr>
+            <w:r/>
+            <w:r>
+              <w:rPr>
+                <w:b/>
+                <w:sz w:val="20"/>
+              </w:rPr>
+              <w:t>4</w:t>
+            </w:r>
+          </w:p>
+        </w:tc>
+        <w:tc>
+          <w:tcPr>
+            <w:tcW w:type="dxa" w:w="825"/>
+            <w:shd w:val="clear" w:color="auto" w:fill="D9D9D9"/>
+          </w:tcPr>
+          <w:p>
+            <w:pPr>
+              <w:spacing w:after="40"/>
+              <w:jc w:val="center"/>
+            </w:pPr>
+            <w:r/>
+            <w:r>
+              <w:rPr>
+                <w:b/>
+                <w:sz w:val="20"/>
+              </w:rPr>
+              <w:t>5</w:t>
+            </w:r>
+          </w:p>
+        </w:tc>
+        <w:tc>
+          <w:tcPr>
+            <w:tcW w:type="dxa" w:w="825"/>
+            <w:shd w:val="clear" w:color="auto" w:fill="D9D9D9"/>
+          </w:tcPr>
+          <w:p>
+            <w:pPr>
+              <w:spacing w:after="40"/>
+              <w:jc w:val="center"/>
+            </w:pPr>
+            <w:r/>
+            <w:r>
+              <w:rPr>
+                <w:b/>
+                <w:sz w:val="20"/>
+              </w:rPr>
+              <w:t>6</w:t>
+            </w:r>
+          </w:p>
+        </w:tc>
+        <w:tc>
+          <w:tcPr>
+            <w:tcW w:type="dxa" w:w="825"/>
+            <w:shd w:val="clear" w:color="auto" w:fill="D9D9D9"/>
+          </w:tcPr>
+          <w:p>
+            <w:pPr>
+              <w:spacing w:after="40"/>
+              <w:jc w:val="center"/>
+            </w:pPr>
+            <w:r/>
+            <w:r>
+              <w:rPr>
+                <w:b/>
+                <w:sz w:val="20"/>
+              </w:rPr>
+              <w:t>7</w:t>
+            </w:r>
+          </w:p>
+        </w:tc>
+        <w:tc>
+          <w:tcPr>
+            <w:tcW w:type="dxa" w:w="825"/>
+            <w:shd w:val="clear" w:color="auto" w:fill="D9D9D9"/>
+          </w:tcPr>
+          <w:p>
+            <w:pPr>
+              <w:spacing w:after="40"/>
+              <w:jc w:val="center"/>
+            </w:pPr>
+            <w:r/>
+            <w:r>
+              <w:rPr>
+                <w:b/>
+                <w:sz w:val="20"/>
+              </w:rPr>
+              <w:t>8</w:t>
+            </w:r>
+          </w:p>
+        </w:tc>
+        <w:tc>
+          <w:tcPr>
+            <w:tcW w:type="dxa" w:w="825"/>
+            <w:shd w:val="clear" w:color="auto" w:fill="D9D9D9"/>
+          </w:tcPr>
+          <w:p>
+            <w:pPr>
+              <w:spacing w:after="40"/>
+              <w:jc w:val="center"/>
+            </w:pPr>
+            <w:r/>
+            <w:r>
+              <w:rPr>
+                <w:b/>
+                <w:sz w:val="20"/>
+              </w:rPr>
+              <w:t>9</w:t>
+            </w:r>
+          </w:p>
+        </w:tc>
+        <w:tc>
+          <w:tcPr>
+            <w:tcW w:type="dxa" w:w="825"/>
+            <w:shd w:val="clear" w:color="auto" w:fill="D9D9D9"/>
+          </w:tcPr>
+          <w:p>
+            <w:pPr>
+              <w:spacing w:after="40"/>
+              <w:jc w:val="center"/>
+            </w:pPr>
+            <w:r/>
+            <w:r>
+              <w:rPr>
+                <w:b/>
+                <w:sz w:val="20"/>
+              </w:rPr>
+              <w:t>10</w:t>
+            </w:r>
+          </w:p>
+        </w:tc>
+      </w:tr>
+      <w:tr>
+        <w:tc>
+          <w:tcPr>
+            <w:tcW w:type="dxa" w:w="825"/>
+          </w:tcPr>
+          <w:p>
+            <w:pPr>
+              <w:spacing w:after="40"/>
+              <w:jc w:val="center"/>
+            </w:pPr>
+            <w:r/>
+            <w:r>
+              <w:rPr>
+                <w:b w:val="0"/>
+                <w:sz w:val="20"/>
+              </w:rPr>
+              <w:t>( )</w:t>
+            </w:r>
+          </w:p>
+        </w:tc>
+        <w:tc>
+          <w:tcPr>
+            <w:tcW w:type="dxa" w:w="825"/>
+          </w:tcPr>
+          <w:p>
+            <w:pPr>
+              <w:spacing w:after="40"/>
+              <w:jc w:val="center"/>
+            </w:pPr>
+            <w:r/>
+            <w:r>
+              <w:rPr>
+                <w:b w:val="0"/>
+                <w:sz w:val="20"/>
+              </w:rPr>
+              <w:t>( )</w:t>
+            </w:r>
+          </w:p>
+        </w:tc>
+        <w:tc>
+          <w:tcPr>
+            <w:tcW w:type="dxa" w:w="825"/>
+          </w:tcPr>
+          <w:p>
+            <w:pPr>
+              <w:spacing w:after="40"/>
+              <w:jc w:val="center"/>
+            </w:pPr>
+            <w:r/>
+            <w:r>
+              <w:rPr>
+                <w:b w:val="0"/>
+                <w:sz w:val="20"/>
+              </w:rPr>
+              <w:t>( )</w:t>
+            </w:r>
+          </w:p>
+        </w:tc>
+        <w:tc>
+          <w:tcPr>
+            <w:tcW w:type="dxa" w:w="825"/>
+          </w:tcPr>
+          <w:p>
+            <w:pPr>
+              <w:spacing w:after="40"/>
+              <w:jc w:val="center"/>
+            </w:pPr>
+            <w:r/>
+            <w:r>
+              <w:rPr>
+                <w:b w:val="0"/>
+                <w:sz w:val="20"/>
+              </w:rPr>
+              <w:t>( )</w:t>
+            </w:r>
+          </w:p>
+        </w:tc>
+        <w:tc>
+          <w:tcPr>
+            <w:tcW w:type="dxa" w:w="825"/>
+          </w:tcPr>
+          <w:p>
+            <w:pPr>
+              <w:spacing w:after="40"/>
+              <w:jc w:val="center"/>
+            </w:pPr>
+            <w:r/>
+            <w:r>
+              <w:rPr>
+                <w:b w:val="0"/>
+                <w:sz w:val="20"/>
+              </w:rPr>
+              <w:t>( )</w:t>
+            </w:r>
+          </w:p>
+        </w:tc>
+        <w:tc>
+          <w:tcPr>
+            <w:tcW w:type="dxa" w:w="825"/>
+          </w:tcPr>
+          <w:p>
+            <w:pPr>
+              <w:spacing w:after="40"/>
+              <w:jc w:val="center"/>
+            </w:pPr>
+            <w:r/>
+            <w:r>
+              <w:rPr>
+                <w:b w:val="0"/>
+                <w:sz w:val="20"/>
+              </w:rPr>
+              <w:t>( )</w:t>
+            </w:r>
+          </w:p>
+        </w:tc>
+        <w:tc>
+          <w:tcPr>
+            <w:tcW w:type="dxa" w:w="825"/>
+          </w:tcPr>
+          <w:p>
+            <w:pPr>
+              <w:spacing w:after="40"/>
+              <w:jc w:val="center"/>
+            </w:pPr>
+            <w:r/>
+            <w:r>
+              <w:rPr>
+                <w:b w:val="0"/>
+                <w:sz w:val="20"/>
+              </w:rPr>
+              <w:t>( )</w:t>
+            </w:r>
+          </w:p>
+        </w:tc>
+        <w:tc>
+          <w:tcPr>
+            <w:tcW w:type="dxa" w:w="825"/>
+          </w:tcPr>
+          <w:p>
+            <w:pPr>
+              <w:spacing w:after="40"/>
+              <w:jc w:val="center"/>
+            </w:pPr>
+            <w:r/>
+            <w:r>
+              <w:rPr>
+                <w:b w:val="0"/>
+                <w:sz w:val="20"/>
+              </w:rPr>
+              <w:t>( )</w:t>
+            </w:r>
+          </w:p>
+        </w:tc>
+        <w:tc>
+          <w:tcPr>
+            <w:tcW w:type="dxa" w:w="825"/>
+          </w:tcPr>
+          <w:p>
+            <w:pPr>
+              <w:spacing w:after="40"/>
+              <w:jc w:val="center"/>
+            </w:pPr>
+            <w:r/>
+            <w:r>
+              <w:rPr>
+                <w:b w:val="0"/>
+                <w:sz w:val="20"/>
+              </w:rPr>
+              <w:t>(X)</w:t>
+            </w:r>
+          </w:p>
+        </w:tc>
+        <w:tc>
+          <w:tcPr>
+            <w:tcW w:type="dxa" w:w="825"/>
+          </w:tcPr>
+          <w:p>
+            <w:pPr>
+              <w:spacing w:after="40"/>
+              <w:jc w:val="center"/>
+            </w:pPr>
+            <w:r/>
+            <w:r>
+              <w:rPr>
+                <w:b w:val="0"/>
+                <w:sz w:val="20"/>
+              </w:rPr>
+              <w:t>( )</w:t>
+            </w:r>
+          </w:p>
+        </w:tc>
+        <w:tc>
+          <w:tcPr>
+            <w:tcW w:type="dxa" w:w="825"/>
+          </w:tcPr>
+          <w:p>
+            <w:pPr>
+              <w:spacing w:after="40"/>
+              <w:jc w:val="center"/>
+            </w:pPr>
+            <w:r/>
+            <w:r>
+              <w:rPr>
+                <w:b w:val="0"/>
+                <w:sz w:val="20"/>
+              </w:rPr>
+              <w:t>( )</w:t>
+            </w:r>
+          </w:p>
+        </w:tc>
+      </w:tr>
+    </w:tbl>
+    <w:p/>
+    <w:p>
+      <w:pPr>
+        <w:spacing w:after="120"/>
+      </w:pPr>
+      <w:r>
+        <w:rPr>
+          <w:b/>
+          <w:sz w:val="20"/>
+        </w:rPr>
+        <w:t>3. A atividade é relevante para a sua formação e articulação de competências e conteúdos?</w:t>
+      </w:r>
+    </w:p>
+    <w:tbl>
+      <w:tblPr>
+        <w:tblStyle w:val="TableGrid"/>
+        <w:tblW w:type="auto" w:w="0"/>
+        <w:jc w:val="center"/>
+        <w:tblLook w:firstColumn="1" w:firstRow="1" w:lastColumn="0" w:lastRow="0" w:noHBand="0" w:noVBand="1" w:val="04A0"/>
+      </w:tblPr>
+      <w:tblGrid>
+        <w:gridCol w:w="825"/>
+        <w:gridCol w:w="825"/>
+        <w:gridCol w:w="825"/>
+        <w:gridCol w:w="825"/>
+        <w:gridCol w:w="825"/>
+        <w:gridCol w:w="825"/>
+        <w:gridCol w:w="825"/>
+        <w:gridCol w:w="825"/>
+        <w:gridCol w:w="825"/>
+        <w:gridCol w:w="825"/>
+        <w:gridCol w:w="825"/>
+      </w:tblGrid>
+      <w:tr>
+        <w:tc>
+          <w:tcPr>
+            <w:tcW w:type="dxa" w:w="825"/>
+            <w:shd w:val="clear" w:color="auto" w:fill="D9D9D9"/>
+          </w:tcPr>
+          <w:p>
+            <w:pPr>
+              <w:spacing w:after="40"/>
+              <w:jc w:val="center"/>
+            </w:pPr>
+            <w:r/>
+            <w:r>
+              <w:rPr>
+                <w:b/>
+                <w:sz w:val="20"/>
+              </w:rPr>
+              <w:t>0</w:t>
+            </w:r>
+          </w:p>
+        </w:tc>
+        <w:tc>
+          <w:tcPr>
+            <w:tcW w:type="dxa" w:w="825"/>
+            <w:shd w:val="clear" w:color="auto" w:fill="D9D9D9"/>
+          </w:tcPr>
+          <w:p>
+            <w:pPr>
+              <w:spacing w:after="40"/>
+              <w:jc w:val="center"/>
+            </w:pPr>
+            <w:r/>
+            <w:r>
+              <w:rPr>
+                <w:b/>
+                <w:sz w:val="20"/>
+              </w:rPr>
+              <w:t>1</w:t>
+            </w:r>
+          </w:p>
+        </w:tc>
+        <w:tc>
+          <w:tcPr>
+            <w:tcW w:type="dxa" w:w="825"/>
+            <w:shd w:val="clear" w:color="auto" w:fill="D9D9D9"/>
+          </w:tcPr>
+          <w:p>
+            <w:pPr>
+              <w:spacing w:after="40"/>
+              <w:jc w:val="center"/>
+            </w:pPr>
+            <w:r/>
+            <w:r>
+              <w:rPr>
+                <w:b/>
+                <w:sz w:val="20"/>
+              </w:rPr>
+              <w:t>2</w:t>
+            </w:r>
+          </w:p>
+        </w:tc>
+        <w:tc>
+          <w:tcPr>
+            <w:tcW w:type="dxa" w:w="825"/>
+            <w:shd w:val="clear" w:color="auto" w:fill="D9D9D9"/>
+          </w:tcPr>
+          <w:p>
+            <w:pPr>
+              <w:spacing w:after="40"/>
+              <w:jc w:val="center"/>
+            </w:pPr>
+            <w:r/>
+            <w:r>
+              <w:rPr>
+                <w:b/>
+                <w:sz w:val="20"/>
+              </w:rPr>
+              <w:t>3</w:t>
+            </w:r>
+          </w:p>
+        </w:tc>
+        <w:tc>
+          <w:tcPr>
+            <w:tcW w:type="dxa" w:w="825"/>
+            <w:shd w:val="clear" w:color="auto" w:fill="D9D9D9"/>
+          </w:tcPr>
+          <w:p>
+            <w:pPr>
+              <w:spacing w:after="40"/>
+              <w:jc w:val="center"/>
+            </w:pPr>
+            <w:r/>
+            <w:r>
+              <w:rPr>
+                <w:b/>
+                <w:sz w:val="20"/>
+              </w:rPr>
+              <w:t>4</w:t>
+            </w:r>
+          </w:p>
+        </w:tc>
+        <w:tc>
+          <w:tcPr>
+            <w:tcW w:type="dxa" w:w="825"/>
+            <w:shd w:val="clear" w:color="auto" w:fill="D9D9D9"/>
+          </w:tcPr>
+          <w:p>
+            <w:pPr>
+              <w:spacing w:after="40"/>
+              <w:jc w:val="center"/>
+            </w:pPr>
+            <w:r/>
+            <w:r>
+              <w:rPr>
+                <w:b/>
+                <w:sz w:val="20"/>
+              </w:rPr>
+              <w:t>5</w:t>
+            </w:r>
+          </w:p>
+        </w:tc>
+        <w:tc>
+          <w:tcPr>
+            <w:tcW w:type="dxa" w:w="825"/>
+            <w:shd w:val="clear" w:color="auto" w:fill="D9D9D9"/>
+          </w:tcPr>
+          <w:p>
+            <w:pPr>
+              <w:spacing w:after="40"/>
+              <w:jc w:val="center"/>
+            </w:pPr>
+            <w:r/>
+            <w:r>
+              <w:rPr>
+                <w:b/>
+                <w:sz w:val="20"/>
+              </w:rPr>
+              <w:t>6</w:t>
+            </w:r>
+          </w:p>
+        </w:tc>
+        <w:tc>
+          <w:tcPr>
+            <w:tcW w:type="dxa" w:w="825"/>
+            <w:shd w:val="clear" w:color="auto" w:fill="D9D9D9"/>
+          </w:tcPr>
+          <w:p>
+            <w:pPr>
+              <w:spacing w:after="40"/>
+              <w:jc w:val="center"/>
+            </w:pPr>
+            <w:r/>
+            <w:r>
+              <w:rPr>
+                <w:b/>
+                <w:sz w:val="20"/>
+              </w:rPr>
+              <w:t>7</w:t>
+            </w:r>
+          </w:p>
+        </w:tc>
+        <w:tc>
+          <w:tcPr>
+            <w:tcW w:type="dxa" w:w="825"/>
+            <w:shd w:val="clear" w:color="auto" w:fill="D9D9D9"/>
+          </w:tcPr>
+          <w:p>
+            <w:pPr>
+              <w:spacing w:after="40"/>
+              <w:jc w:val="center"/>
+            </w:pPr>
+            <w:r/>
+            <w:r>
+              <w:rPr>
+                <w:b/>
+                <w:sz w:val="20"/>
+              </w:rPr>
+              <w:t>8</w:t>
+            </w:r>
+          </w:p>
+        </w:tc>
+        <w:tc>
+          <w:tcPr>
+            <w:tcW w:type="dxa" w:w="825"/>
+            <w:shd w:val="clear" w:color="auto" w:fill="D9D9D9"/>
+          </w:tcPr>
+          <w:p>
+            <w:pPr>
+              <w:spacing w:after="40"/>
+              <w:jc w:val="center"/>
+            </w:pPr>
+            <w:r/>
+            <w:r>
+              <w:rPr>
+                <w:b/>
+                <w:sz w:val="20"/>
+              </w:rPr>
+              <w:t>9</w:t>
+            </w:r>
+          </w:p>
+        </w:tc>
+        <w:tc>
+          <w:tcPr>
+            <w:tcW w:type="dxa" w:w="825"/>
+            <w:shd w:val="clear" w:color="auto" w:fill="D9D9D9"/>
+          </w:tcPr>
+          <w:p>
+            <w:pPr>
+              <w:spacing w:after="40"/>
+              <w:jc w:val="center"/>
+            </w:pPr>
+            <w:r/>
+            <w:r>
+              <w:rPr>
+                <w:b/>
+                <w:sz w:val="20"/>
+              </w:rPr>
+              <w:t>10</w:t>
+            </w:r>
+          </w:p>
+        </w:tc>
+      </w:tr>
+      <w:tr>
+        <w:tc>
+          <w:tcPr>
+            <w:tcW w:type="dxa" w:w="825"/>
+          </w:tcPr>
+          <w:p>
+            <w:pPr>
+              <w:spacing w:after="40"/>
+              <w:jc w:val="center"/>
+            </w:pPr>
+            <w:r/>
+            <w:r>
+              <w:rPr>
+                <w:b w:val="0"/>
+                <w:sz w:val="20"/>
+              </w:rPr>
+              <w:t>( )</w:t>
+            </w:r>
+          </w:p>
+        </w:tc>
+        <w:tc>
+          <w:tcPr>
+            <w:tcW w:type="dxa" w:w="825"/>
+          </w:tcPr>
+          <w:p>
+            <w:pPr>
+              <w:spacing w:after="40"/>
+              <w:jc w:val="center"/>
+            </w:pPr>
+            <w:r/>
+            <w:r>
+              <w:rPr>
+                <w:b w:val="0"/>
+                <w:sz w:val="20"/>
+              </w:rPr>
+              <w:t>( )</w:t>
+            </w:r>
+          </w:p>
+        </w:tc>
+        <w:tc>
+          <w:tcPr>
+            <w:tcW w:type="dxa" w:w="825"/>
+          </w:tcPr>
+          <w:p>
+            <w:pPr>
+              <w:spacing w:after="40"/>
+              <w:jc w:val="center"/>
+            </w:pPr>
+            <w:r/>
+            <w:r>
+              <w:rPr>
+                <w:b w:val="0"/>
+                <w:sz w:val="20"/>
+              </w:rPr>
+              <w:t>( )</w:t>
+            </w:r>
+          </w:p>
+        </w:tc>
+        <w:tc>
+          <w:tcPr>
+            <w:tcW w:type="dxa" w:w="825"/>
+          </w:tcPr>
+          <w:p>
+            <w:pPr>
+              <w:spacing w:after="40"/>
+              <w:jc w:val="center"/>
+            </w:pPr>
+            <w:r/>
+            <w:r>
+              <w:rPr>
+                <w:b w:val="0"/>
+                <w:sz w:val="20"/>
+              </w:rPr>
+              <w:t>( )</w:t>
+            </w:r>
+          </w:p>
+        </w:tc>
+        <w:tc>
+          <w:tcPr>
+            <w:tcW w:type="dxa" w:w="825"/>
+          </w:tcPr>
+          <w:p>
+            <w:pPr>
+              <w:spacing w:after="40"/>
+              <w:jc w:val="center"/>
+            </w:pPr>
+            <w:r/>
+            <w:r>
+              <w:rPr>
+                <w:b w:val="0"/>
+                <w:sz w:val="20"/>
+              </w:rPr>
+              <w:t>( )</w:t>
+            </w:r>
+          </w:p>
+        </w:tc>
+        <w:tc>
+          <w:tcPr>
+            <w:tcW w:type="dxa" w:w="825"/>
+          </w:tcPr>
+          <w:p>
+            <w:pPr>
+              <w:spacing w:after="40"/>
+              <w:jc w:val="center"/>
+            </w:pPr>
+            <w:r/>
+            <w:r>
+              <w:rPr>
+                <w:b w:val="0"/>
+                <w:sz w:val="20"/>
+              </w:rPr>
+              <w:t>( )</w:t>
+            </w:r>
+          </w:p>
+        </w:tc>
+        <w:tc>
+          <w:tcPr>
+            <w:tcW w:type="dxa" w:w="825"/>
+          </w:tcPr>
+          <w:p>
+            <w:pPr>
+              <w:spacing w:after="40"/>
+              <w:jc w:val="center"/>
+            </w:pPr>
+            <w:r/>
+            <w:r>
+              <w:rPr>
+                <w:b w:val="0"/>
+                <w:sz w:val="20"/>
+              </w:rPr>
+              <w:t>( )</w:t>
+            </w:r>
+          </w:p>
+        </w:tc>
+        <w:tc>
+          <w:tcPr>
+            <w:tcW w:type="dxa" w:w="825"/>
+          </w:tcPr>
+          <w:p>
+            <w:pPr>
+              <w:spacing w:after="40"/>
+              <w:jc w:val="center"/>
+            </w:pPr>
+            <w:r/>
+            <w:r>
+              <w:rPr>
+                <w:b w:val="0"/>
+                <w:sz w:val="20"/>
+              </w:rPr>
+              <w:t>( )</w:t>
+            </w:r>
+          </w:p>
+        </w:tc>
+        <w:tc>
+          <w:tcPr>
+            <w:tcW w:type="dxa" w:w="825"/>
+          </w:tcPr>
+          <w:p>
+            <w:pPr>
+              <w:spacing w:after="40"/>
+              <w:jc w:val="center"/>
+            </w:pPr>
+            <w:r/>
+            <w:r>
+              <w:rPr>
+                <w:b w:val="0"/>
+                <w:sz w:val="20"/>
+              </w:rPr>
+              <w:t>( )</w:t>
+            </w:r>
+          </w:p>
+        </w:tc>
+        <w:tc>
+          <w:tcPr>
+            <w:tcW w:type="dxa" w:w="825"/>
+          </w:tcPr>
+          <w:p>
+            <w:pPr>
+              <w:spacing w:after="40"/>
+              <w:jc w:val="center"/>
+            </w:pPr>
+            <w:r/>
+            <w:r>
+              <w:rPr>
+                <w:b w:val="0"/>
+                <w:sz w:val="20"/>
+              </w:rPr>
+              <w:t>(X)</w:t>
+            </w:r>
+          </w:p>
+        </w:tc>
+        <w:tc>
+          <w:tcPr>
+            <w:tcW w:type="dxa" w:w="825"/>
+          </w:tcPr>
+          <w:p>
+            <w:pPr>
+              <w:spacing w:after="40"/>
+              <w:jc w:val="center"/>
+            </w:pPr>
+            <w:r/>
+            <w:r>
+              <w:rPr>
+                <w:b w:val="0"/>
+                <w:sz w:val="20"/>
+              </w:rPr>
+              <w:t>( )</w:t>
+            </w:r>
+          </w:p>
+        </w:tc>
+      </w:tr>
+    </w:tbl>
+    <w:p/>
+    <w:p>
+      <w:pPr>
+        <w:spacing w:after="120"/>
+      </w:pPr>
+      <w:r>
+        <w:rPr>
+          <w:b/>
+          <w:sz w:val="20"/>
+        </w:rPr>
+        <w:t>4. A atividade contribui para o cumprimento dos objetivos definidos pela Instituição de Ensino (IES) e Curso, observando o Plano de Desenvolvimento Institucional e Projeto Pedagógico de Curso vigentes?</w:t>
+      </w:r>
+    </w:p>
+    <w:tbl>
+      <w:tblPr>
+        <w:tblStyle w:val="TableGrid"/>
+        <w:tblW w:type="auto" w:w="0"/>
+        <w:jc w:val="center"/>
+        <w:tblLook w:firstColumn="1" w:firstRow="1" w:lastColumn="0" w:lastRow="0" w:noHBand="0" w:noVBand="1" w:val="04A0"/>
+      </w:tblPr>
+      <w:tblGrid>
+        <w:gridCol w:w="825"/>
+        <w:gridCol w:w="825"/>
+        <w:gridCol w:w="825"/>
+        <w:gridCol w:w="825"/>
+        <w:gridCol w:w="825"/>
+        <w:gridCol w:w="825"/>
+        <w:gridCol w:w="825"/>
+        <w:gridCol w:w="825"/>
+        <w:gridCol w:w="825"/>
+        <w:gridCol w:w="825"/>
+        <w:gridCol w:w="825"/>
+      </w:tblGrid>
+      <w:tr>
+        <w:tc>
+          <w:tcPr>
+            <w:tcW w:type="dxa" w:w="825"/>
+            <w:shd w:val="clear" w:color="auto" w:fill="D9D9D9"/>
+          </w:tcPr>
+          <w:p>
+            <w:pPr>
+              <w:spacing w:after="40"/>
+              <w:jc w:val="center"/>
+            </w:pPr>
+            <w:r/>
+            <w:r>
+              <w:rPr>
+                <w:b/>
+                <w:sz w:val="20"/>
+              </w:rPr>
+              <w:t>0</w:t>
+            </w:r>
+          </w:p>
+        </w:tc>
+        <w:tc>
+          <w:tcPr>
+            <w:tcW w:type="dxa" w:w="825"/>
+            <w:shd w:val="clear" w:color="auto" w:fill="D9D9D9"/>
+          </w:tcPr>
+          <w:p>
+            <w:pPr>
+              <w:spacing w:after="40"/>
+              <w:jc w:val="center"/>
+            </w:pPr>
+            <w:r/>
+            <w:r>
+              <w:rPr>
+                <w:b/>
+                <w:sz w:val="20"/>
+              </w:rPr>
+              <w:t>1</w:t>
+            </w:r>
+          </w:p>
+        </w:tc>
+        <w:tc>
+          <w:tcPr>
+            <w:tcW w:type="dxa" w:w="825"/>
+            <w:shd w:val="clear" w:color="auto" w:fill="D9D9D9"/>
+          </w:tcPr>
+          <w:p>
+            <w:pPr>
+              <w:spacing w:after="40"/>
+              <w:jc w:val="center"/>
+            </w:pPr>
+            <w:r/>
+            <w:r>
+              <w:rPr>
+                <w:b/>
+                <w:sz w:val="20"/>
+              </w:rPr>
+              <w:t>2</w:t>
+            </w:r>
+          </w:p>
+        </w:tc>
+        <w:tc>
+          <w:tcPr>
+            <w:tcW w:type="dxa" w:w="825"/>
+            <w:shd w:val="clear" w:color="auto" w:fill="D9D9D9"/>
+          </w:tcPr>
+          <w:p>
+            <w:pPr>
+              <w:spacing w:after="40"/>
+              <w:jc w:val="center"/>
+            </w:pPr>
+            <w:r/>
+            <w:r>
+              <w:rPr>
+                <w:b/>
+                <w:sz w:val="20"/>
+              </w:rPr>
+              <w:t>3</w:t>
+            </w:r>
+          </w:p>
+        </w:tc>
+        <w:tc>
+          <w:tcPr>
+            <w:tcW w:type="dxa" w:w="825"/>
+            <w:shd w:val="clear" w:color="auto" w:fill="D9D9D9"/>
+          </w:tcPr>
+          <w:p>
+            <w:pPr>
+              <w:spacing w:after="40"/>
+              <w:jc w:val="center"/>
+            </w:pPr>
+            <w:r/>
+            <w:r>
+              <w:rPr>
+                <w:b/>
+                <w:sz w:val="20"/>
+              </w:rPr>
+              <w:t>4</w:t>
+            </w:r>
+          </w:p>
+        </w:tc>
+        <w:tc>
+          <w:tcPr>
+            <w:tcW w:type="dxa" w:w="825"/>
+            <w:shd w:val="clear" w:color="auto" w:fill="D9D9D9"/>
+          </w:tcPr>
+          <w:p>
+            <w:pPr>
+              <w:spacing w:after="40"/>
+              <w:jc w:val="center"/>
+            </w:pPr>
+            <w:r/>
+            <w:r>
+              <w:rPr>
+                <w:b/>
+                <w:sz w:val="20"/>
+              </w:rPr>
+              <w:t>5</w:t>
+            </w:r>
+          </w:p>
+        </w:tc>
+        <w:tc>
+          <w:tcPr>
+            <w:tcW w:type="dxa" w:w="825"/>
+            <w:shd w:val="clear" w:color="auto" w:fill="D9D9D9"/>
+          </w:tcPr>
+          <w:p>
+            <w:pPr>
+              <w:spacing w:after="40"/>
+              <w:jc w:val="center"/>
+            </w:pPr>
+            <w:r/>
+            <w:r>
+              <w:rPr>
+                <w:b/>
+                <w:sz w:val="20"/>
+              </w:rPr>
+              <w:t>6</w:t>
+            </w:r>
+          </w:p>
+        </w:tc>
+        <w:tc>
+          <w:tcPr>
+            <w:tcW w:type="dxa" w:w="825"/>
+            <w:shd w:val="clear" w:color="auto" w:fill="D9D9D9"/>
+          </w:tcPr>
+          <w:p>
+            <w:pPr>
+              <w:spacing w:after="40"/>
+              <w:jc w:val="center"/>
+            </w:pPr>
+            <w:r/>
+            <w:r>
+              <w:rPr>
+                <w:b/>
+                <w:sz w:val="20"/>
+              </w:rPr>
+              <w:t>7</w:t>
+            </w:r>
+          </w:p>
+        </w:tc>
+        <w:tc>
+          <w:tcPr>
+            <w:tcW w:type="dxa" w:w="825"/>
+            <w:shd w:val="clear" w:color="auto" w:fill="D9D9D9"/>
+          </w:tcPr>
+          <w:p>
+            <w:pPr>
+              <w:spacing w:after="40"/>
+              <w:jc w:val="center"/>
+            </w:pPr>
+            <w:r/>
+            <w:r>
+              <w:rPr>
+                <w:b/>
+                <w:sz w:val="20"/>
+              </w:rPr>
+              <w:t>8</w:t>
+            </w:r>
+          </w:p>
+        </w:tc>
+        <w:tc>
+          <w:tcPr>
+            <w:tcW w:type="dxa" w:w="825"/>
+            <w:shd w:val="clear" w:color="auto" w:fill="D9D9D9"/>
+          </w:tcPr>
+          <w:p>
+            <w:pPr>
+              <w:spacing w:after="40"/>
+              <w:jc w:val="center"/>
+            </w:pPr>
+            <w:r/>
+            <w:r>
+              <w:rPr>
+                <w:b/>
+                <w:sz w:val="20"/>
+              </w:rPr>
+              <w:t>9</w:t>
+            </w:r>
+          </w:p>
+        </w:tc>
+        <w:tc>
+          <w:tcPr>
+            <w:tcW w:type="dxa" w:w="825"/>
+            <w:shd w:val="clear" w:color="auto" w:fill="D9D9D9"/>
+          </w:tcPr>
+          <w:p>
+            <w:pPr>
+              <w:spacing w:after="40"/>
+              <w:jc w:val="center"/>
+            </w:pPr>
+            <w:r/>
+            <w:r>
+              <w:rPr>
+                <w:b/>
+                <w:sz w:val="20"/>
+              </w:rPr>
+              <w:t>10</w:t>
+            </w:r>
+          </w:p>
+        </w:tc>
+      </w:tr>
+      <w:tr>
+        <w:tc>
+          <w:tcPr>
+            <w:tcW w:type="dxa" w:w="825"/>
+          </w:tcPr>
+          <w:p>
+            <w:pPr>
+              <w:spacing w:after="40"/>
+              <w:jc w:val="center"/>
+            </w:pPr>
+            <w:r/>
+            <w:r>
+              <w:rPr>
+                <w:b w:val="0"/>
+                <w:sz w:val="20"/>
+              </w:rPr>
+              <w:t>( )</w:t>
+            </w:r>
+          </w:p>
+        </w:tc>
+        <w:tc>
+          <w:tcPr>
+            <w:tcW w:type="dxa" w:w="825"/>
+          </w:tcPr>
+          <w:p>
+            <w:pPr>
+              <w:spacing w:after="40"/>
+              <w:jc w:val="center"/>
+            </w:pPr>
+            <w:r/>
+            <w:r>
+              <w:rPr>
+                <w:b w:val="0"/>
+                <w:sz w:val="20"/>
+              </w:rPr>
+              <w:t>( )</w:t>
+            </w:r>
+          </w:p>
+        </w:tc>
+        <w:tc>
+          <w:tcPr>
+            <w:tcW w:type="dxa" w:w="825"/>
+          </w:tcPr>
+          <w:p>
+            <w:pPr>
+              <w:spacing w:after="40"/>
+              <w:jc w:val="center"/>
+            </w:pPr>
+            <w:r/>
+            <w:r>
+              <w:rPr>
+                <w:b w:val="0"/>
+                <w:sz w:val="20"/>
+              </w:rPr>
+              <w:t>( )</w:t>
+            </w:r>
+          </w:p>
+        </w:tc>
+        <w:tc>
+          <w:tcPr>
+            <w:tcW w:type="dxa" w:w="825"/>
+          </w:tcPr>
+          <w:p>
+            <w:pPr>
+              <w:spacing w:after="40"/>
+              <w:jc w:val="center"/>
+            </w:pPr>
+            <w:r/>
+            <w:r>
+              <w:rPr>
+                <w:b w:val="0"/>
+                <w:sz w:val="20"/>
+              </w:rPr>
+              <w:t>( )</w:t>
+            </w:r>
+          </w:p>
+        </w:tc>
+        <w:tc>
+          <w:tcPr>
+            <w:tcW w:type="dxa" w:w="825"/>
+          </w:tcPr>
+          <w:p>
+            <w:pPr>
+              <w:spacing w:after="40"/>
+              <w:jc w:val="center"/>
+            </w:pPr>
+            <w:r/>
+            <w:r>
+              <w:rPr>
+                <w:b w:val="0"/>
+                <w:sz w:val="20"/>
+              </w:rPr>
+              <w:t>( )</w:t>
+            </w:r>
+          </w:p>
+        </w:tc>
+        <w:tc>
+          <w:tcPr>
+            <w:tcW w:type="dxa" w:w="825"/>
+          </w:tcPr>
+          <w:p>
+            <w:pPr>
+              <w:spacing w:after="40"/>
+              <w:jc w:val="center"/>
+            </w:pPr>
+            <w:r/>
+            <w:r>
+              <w:rPr>
+                <w:b w:val="0"/>
+                <w:sz w:val="20"/>
+              </w:rPr>
+              <w:t>( )</w:t>
+            </w:r>
+          </w:p>
+        </w:tc>
+        <w:tc>
+          <w:tcPr>
+            <w:tcW w:type="dxa" w:w="825"/>
+          </w:tcPr>
+          <w:p>
+            <w:pPr>
+              <w:spacing w:after="40"/>
+              <w:jc w:val="center"/>
+            </w:pPr>
+            <w:r/>
+            <w:r>
+              <w:rPr>
+                <w:b w:val="0"/>
+                <w:sz w:val="20"/>
+              </w:rPr>
+              <w:t>( )</w:t>
+            </w:r>
+          </w:p>
+        </w:tc>
+        <w:tc>
+          <w:tcPr>
+            <w:tcW w:type="dxa" w:w="825"/>
+          </w:tcPr>
+          <w:p>
+            <w:pPr>
+              <w:spacing w:after="40"/>
+              <w:jc w:val="center"/>
+            </w:pPr>
+            <w:r/>
+            <w:r>
+              <w:rPr>
+                <w:b w:val="0"/>
+                <w:sz w:val="20"/>
+              </w:rPr>
+              <w:t>( )</w:t>
+            </w:r>
+          </w:p>
+        </w:tc>
+        <w:tc>
+          <w:tcPr>
+            <w:tcW w:type="dxa" w:w="825"/>
+          </w:tcPr>
+          <w:p>
+            <w:pPr>
+              <w:spacing w:after="40"/>
+              <w:jc w:val="center"/>
+            </w:pPr>
+            <w:r/>
+            <w:r>
+              <w:rPr>
+                <w:b w:val="0"/>
+                <w:sz w:val="20"/>
+              </w:rPr>
+              <w:t>(X)</w:t>
+            </w:r>
+          </w:p>
+        </w:tc>
+        <w:tc>
+          <w:tcPr>
+            <w:tcW w:type="dxa" w:w="825"/>
+          </w:tcPr>
+          <w:p>
+            <w:pPr>
+              <w:spacing w:after="40"/>
+              <w:jc w:val="center"/>
+            </w:pPr>
+            <w:r/>
+            <w:r>
+              <w:rPr>
+                <w:b w:val="0"/>
+                <w:sz w:val="20"/>
+              </w:rPr>
+              <w:t>( )</w:t>
+            </w:r>
+          </w:p>
+        </w:tc>
+        <w:tc>
+          <w:tcPr>
+            <w:tcW w:type="dxa" w:w="825"/>
+          </w:tcPr>
+          <w:p>
+            <w:pPr>
+              <w:spacing w:after="40"/>
+              <w:jc w:val="center"/>
+            </w:pPr>
+            <w:r/>
+            <w:r>
+              <w:rPr>
+                <w:b w:val="0"/>
+                <w:sz w:val="20"/>
+              </w:rPr>
+              <w:t>( )</w:t>
+            </w:r>
+          </w:p>
+        </w:tc>
+      </w:tr>
+    </w:tbl>
+    <w:p/>
+    <w:p>
+      <w:pPr>
+        <w:spacing w:after="120"/>
+      </w:pPr>
+      <w:r>
+        <w:rPr>
+          <w:b/>
+          <w:sz w:val="20"/>
+        </w:rPr>
+        <w:t>5. A atividade contribui para a melhoria da sociedade por meio dos resultados demonstrados no relatório ou pelos relatos apresentados pelos envolvidos?</w:t>
+      </w:r>
+    </w:p>
+    <w:tbl>
+      <w:tblPr>
+        <w:tblStyle w:val="TableGrid"/>
+        <w:tblW w:type="auto" w:w="0"/>
+        <w:jc w:val="center"/>
+        <w:tblLook w:firstColumn="1" w:firstRow="1" w:lastColumn="0" w:lastRow="0" w:noHBand="0" w:noVBand="1" w:val="04A0"/>
+      </w:tblPr>
+      <w:tblGrid>
+        <w:gridCol w:w="825"/>
+        <w:gridCol w:w="825"/>
+        <w:gridCol w:w="825"/>
+        <w:gridCol w:w="825"/>
+        <w:gridCol w:w="825"/>
+        <w:gridCol w:w="825"/>
+        <w:gridCol w:w="825"/>
+        <w:gridCol w:w="825"/>
+        <w:gridCol w:w="825"/>
+        <w:gridCol w:w="825"/>
+        <w:gridCol w:w="825"/>
+      </w:tblGrid>
+      <w:tr>
+        <w:tc>
+          <w:tcPr>
+            <w:tcW w:type="dxa" w:w="825"/>
+            <w:shd w:val="clear" w:color="auto" w:fill="D9D9D9"/>
+          </w:tcPr>
+          <w:p>
+            <w:pPr>
+              <w:spacing w:after="40"/>
+              <w:jc w:val="center"/>
+            </w:pPr>
+            <w:r/>
+            <w:r>
+              <w:rPr>
+                <w:b/>
+                <w:sz w:val="20"/>
+              </w:rPr>
+              <w:t>0</w:t>
+            </w:r>
+          </w:p>
+        </w:tc>
+        <w:tc>
+          <w:tcPr>
+            <w:tcW w:type="dxa" w:w="825"/>
+            <w:shd w:val="clear" w:color="auto" w:fill="D9D9D9"/>
+          </w:tcPr>
+          <w:p>
+            <w:pPr>
+              <w:spacing w:after="40"/>
+              <w:jc w:val="center"/>
+            </w:pPr>
+            <w:r/>
+            <w:r>
+              <w:rPr>
+                <w:b/>
+                <w:sz w:val="20"/>
+              </w:rPr>
+              <w:t>1</w:t>
+            </w:r>
+          </w:p>
+        </w:tc>
+        <w:tc>
+          <w:tcPr>
+            <w:tcW w:type="dxa" w:w="825"/>
+            <w:shd w:val="clear" w:color="auto" w:fill="D9D9D9"/>
+          </w:tcPr>
+          <w:p>
+            <w:pPr>
+              <w:spacing w:after="40"/>
+              <w:jc w:val="center"/>
+            </w:pPr>
+            <w:r/>
+            <w:r>
+              <w:rPr>
+                <w:b/>
+                <w:sz w:val="20"/>
+              </w:rPr>
+              <w:t>2</w:t>
+            </w:r>
+          </w:p>
+        </w:tc>
+        <w:tc>
+          <w:tcPr>
+            <w:tcW w:type="dxa" w:w="825"/>
+            <w:shd w:val="clear" w:color="auto" w:fill="D9D9D9"/>
+          </w:tcPr>
+          <w:p>
+            <w:pPr>
+              <w:spacing w:after="40"/>
+              <w:jc w:val="center"/>
+            </w:pPr>
+            <w:r/>
+            <w:r>
+              <w:rPr>
+                <w:b/>
+                <w:sz w:val="20"/>
+              </w:rPr>
+              <w:t>3</w:t>
+            </w:r>
+          </w:p>
+        </w:tc>
+        <w:tc>
+          <w:tcPr>
+            <w:tcW w:type="dxa" w:w="825"/>
+            <w:shd w:val="clear" w:color="auto" w:fill="D9D9D9"/>
+          </w:tcPr>
+          <w:p>
+            <w:pPr>
+              <w:spacing w:after="40"/>
+              <w:jc w:val="center"/>
+            </w:pPr>
+            <w:r/>
+            <w:r>
+              <w:rPr>
+                <w:b/>
+                <w:sz w:val="20"/>
+              </w:rPr>
+              <w:t>4</w:t>
+            </w:r>
+          </w:p>
+        </w:tc>
+        <w:tc>
+          <w:tcPr>
+            <w:tcW w:type="dxa" w:w="825"/>
+            <w:shd w:val="clear" w:color="auto" w:fill="D9D9D9"/>
+          </w:tcPr>
+          <w:p>
+            <w:pPr>
+              <w:spacing w:after="40"/>
+              <w:jc w:val="center"/>
+            </w:pPr>
+            <w:r/>
+            <w:r>
+              <w:rPr>
+                <w:b/>
+                <w:sz w:val="20"/>
+              </w:rPr>
+              <w:t>5</w:t>
+            </w:r>
+          </w:p>
+        </w:tc>
+        <w:tc>
+          <w:tcPr>
+            <w:tcW w:type="dxa" w:w="825"/>
+            <w:shd w:val="clear" w:color="auto" w:fill="D9D9D9"/>
+          </w:tcPr>
+          <w:p>
+            <w:pPr>
+              <w:spacing w:after="40"/>
+              <w:jc w:val="center"/>
+            </w:pPr>
+            <w:r/>
+            <w:r>
+              <w:rPr>
+                <w:b/>
+                <w:sz w:val="20"/>
+              </w:rPr>
+              <w:t>6</w:t>
+            </w:r>
+          </w:p>
+        </w:tc>
+        <w:tc>
+          <w:tcPr>
+            <w:tcW w:type="dxa" w:w="825"/>
+            <w:shd w:val="clear" w:color="auto" w:fill="D9D9D9"/>
+          </w:tcPr>
+          <w:p>
+            <w:pPr>
+              <w:spacing w:after="40"/>
+              <w:jc w:val="center"/>
+            </w:pPr>
+            <w:r/>
+            <w:r>
+              <w:rPr>
+                <w:b/>
+                <w:sz w:val="20"/>
+              </w:rPr>
+              <w:t>7</w:t>
+            </w:r>
+          </w:p>
+        </w:tc>
+        <w:tc>
+          <w:tcPr>
+            <w:tcW w:type="dxa" w:w="825"/>
+            <w:shd w:val="clear" w:color="auto" w:fill="D9D9D9"/>
+          </w:tcPr>
+          <w:p>
+            <w:pPr>
+              <w:spacing w:after="40"/>
+              <w:jc w:val="center"/>
+            </w:pPr>
+            <w:r/>
+            <w:r>
+              <w:rPr>
+                <w:b/>
+                <w:sz w:val="20"/>
+              </w:rPr>
+              <w:t>8</w:t>
+            </w:r>
+          </w:p>
+        </w:tc>
+        <w:tc>
+          <w:tcPr>
+            <w:tcW w:type="dxa" w:w="825"/>
+            <w:shd w:val="clear" w:color="auto" w:fill="D9D9D9"/>
+          </w:tcPr>
+          <w:p>
+            <w:pPr>
+              <w:spacing w:after="40"/>
+              <w:jc w:val="center"/>
+            </w:pPr>
+            <w:r/>
+            <w:r>
+              <w:rPr>
+                <w:b/>
+                <w:sz w:val="20"/>
+              </w:rPr>
+              <w:t>9</w:t>
+            </w:r>
+          </w:p>
+        </w:tc>
+        <w:tc>
+          <w:tcPr>
+            <w:tcW w:type="dxa" w:w="825"/>
+            <w:shd w:val="clear" w:color="auto" w:fill="D9D9D9"/>
+          </w:tcPr>
+          <w:p>
+            <w:pPr>
+              <w:spacing w:after="40"/>
+              <w:jc w:val="center"/>
+            </w:pPr>
+            <w:r/>
+            <w:r>
+              <w:rPr>
+                <w:b/>
+                <w:sz w:val="20"/>
+              </w:rPr>
+              <w:t>10</w:t>
+            </w:r>
+          </w:p>
+        </w:tc>
+      </w:tr>
+      <w:tr>
+        <w:tc>
+          <w:tcPr>
+            <w:tcW w:type="dxa" w:w="825"/>
+          </w:tcPr>
+          <w:p>
+            <w:pPr>
+              <w:spacing w:after="40"/>
+              <w:jc w:val="center"/>
+            </w:pPr>
+            <w:r/>
+            <w:r>
+              <w:rPr>
+                <w:b w:val="0"/>
+                <w:sz w:val="20"/>
+              </w:rPr>
+              <w:t>( )</w:t>
+            </w:r>
+          </w:p>
+        </w:tc>
+        <w:tc>
+          <w:tcPr>
+            <w:tcW w:type="dxa" w:w="825"/>
+          </w:tcPr>
+          <w:p>
+            <w:pPr>
+              <w:spacing w:after="40"/>
+              <w:jc w:val="center"/>
+            </w:pPr>
+            <w:r/>
+            <w:r>
+              <w:rPr>
+                <w:b w:val="0"/>
+                <w:sz w:val="20"/>
+              </w:rPr>
+              <w:t>( )</w:t>
+            </w:r>
+          </w:p>
+        </w:tc>
+        <w:tc>
+          <w:tcPr>
+            <w:tcW w:type="dxa" w:w="825"/>
+          </w:tcPr>
+          <w:p>
+            <w:pPr>
+              <w:spacing w:after="40"/>
+              <w:jc w:val="center"/>
+            </w:pPr>
+            <w:r/>
+            <w:r>
+              <w:rPr>
+                <w:b w:val="0"/>
+                <w:sz w:val="20"/>
+              </w:rPr>
+              <w:t>( )</w:t>
+            </w:r>
+          </w:p>
+        </w:tc>
+        <w:tc>
+          <w:tcPr>
+            <w:tcW w:type="dxa" w:w="825"/>
+          </w:tcPr>
+          <w:p>
+            <w:pPr>
+              <w:spacing w:after="40"/>
+              <w:jc w:val="center"/>
+            </w:pPr>
+            <w:r/>
+            <w:r>
+              <w:rPr>
+                <w:b w:val="0"/>
+                <w:sz w:val="20"/>
+              </w:rPr>
+              <w:t>( )</w:t>
+            </w:r>
+          </w:p>
+        </w:tc>
+        <w:tc>
+          <w:tcPr>
+            <w:tcW w:type="dxa" w:w="825"/>
+          </w:tcPr>
+          <w:p>
+            <w:pPr>
+              <w:spacing w:after="40"/>
+              <w:jc w:val="center"/>
+            </w:pPr>
+            <w:r/>
+            <w:r>
+              <w:rPr>
+                <w:b w:val="0"/>
+                <w:sz w:val="20"/>
+              </w:rPr>
+              <w:t>( )</w:t>
+            </w:r>
+          </w:p>
+        </w:tc>
+        <w:tc>
+          <w:tcPr>
+            <w:tcW w:type="dxa" w:w="825"/>
+          </w:tcPr>
+          <w:p>
+            <w:pPr>
+              <w:spacing w:after="40"/>
+              <w:jc w:val="center"/>
+            </w:pPr>
+            <w:r/>
+            <w:r>
+              <w:rPr>
+                <w:b w:val="0"/>
+                <w:sz w:val="20"/>
+              </w:rPr>
+              <w:t>(X)</w:t>
+            </w:r>
+          </w:p>
+        </w:tc>
+        <w:tc>
+          <w:tcPr>
+            <w:tcW w:type="dxa" w:w="825"/>
+          </w:tcPr>
+          <w:p>
+            <w:pPr>
+              <w:spacing w:after="40"/>
+              <w:jc w:val="center"/>
+            </w:pPr>
+            <w:r/>
+            <w:r>
+              <w:rPr>
+                <w:b w:val="0"/>
+                <w:sz w:val="20"/>
+              </w:rPr>
+              <w:t>( )</w:t>
+            </w:r>
+          </w:p>
+        </w:tc>
+        <w:tc>
+          <w:tcPr>
+            <w:tcW w:type="dxa" w:w="825"/>
+          </w:tcPr>
+          <w:p>
+            <w:pPr>
+              <w:spacing w:after="40"/>
+              <w:jc w:val="center"/>
+            </w:pPr>
+            <w:r/>
+            <w:r>
+              <w:rPr>
+                <w:b w:val="0"/>
+                <w:sz w:val="20"/>
+              </w:rPr>
+              <w:t>( )</w:t>
+            </w:r>
+          </w:p>
+        </w:tc>
+        <w:tc>
+          <w:tcPr>
+            <w:tcW w:type="dxa" w:w="825"/>
+          </w:tcPr>
+          <w:p>
+            <w:pPr>
+              <w:spacing w:after="40"/>
+              <w:jc w:val="center"/>
+            </w:pPr>
+            <w:r/>
+            <w:r>
+              <w:rPr>
+                <w:b w:val="0"/>
+                <w:sz w:val="20"/>
+              </w:rPr>
+              <w:t>( )</w:t>
+            </w:r>
+          </w:p>
+        </w:tc>
+        <w:tc>
+          <w:tcPr>
+            <w:tcW w:type="dxa" w:w="825"/>
+          </w:tcPr>
+          <w:p>
+            <w:pPr>
+              <w:spacing w:after="40"/>
+              <w:jc w:val="center"/>
+            </w:pPr>
+            <w:r/>
+            <w:r>
+              <w:rPr>
+                <w:b w:val="0"/>
+                <w:sz w:val="20"/>
+              </w:rPr>
+              <w:t>( )</w:t>
+            </w:r>
+          </w:p>
+        </w:tc>
+        <w:tc>
+          <w:tcPr>
+            <w:tcW w:type="dxa" w:w="825"/>
+          </w:tcPr>
+          <w:p>
+            <w:pPr>
+              <w:spacing w:after="40"/>
+              <w:jc w:val="center"/>
+            </w:pPr>
+            <w:r/>
+            <w:r>
+              <w:rPr>
+                <w:b w:val="0"/>
+                <w:sz w:val="20"/>
+              </w:rPr>
+              <w:t>( )</w:t>
+            </w:r>
+          </w:p>
+        </w:tc>
+      </w:tr>
+    </w:tbl>
+    <w:p/>
+    <w:p>
+      <w:pPr>
+        <w:spacing w:after="120"/>
+      </w:pPr>
+      <w:r>
+        <w:rPr>
+          <w:b/>
+          <w:sz w:val="20"/>
+        </w:rPr>
+        <w:t>6. A atividade permite o desenvolvimento de ações junto à Iniciação Científica e ao Ensino?</w:t>
+      </w:r>
+    </w:p>
+    <w:tbl>
+      <w:tblPr>
+        <w:tblStyle w:val="TableGrid"/>
+        <w:tblW w:type="auto" w:w="0"/>
+        <w:jc w:val="center"/>
+        <w:tblLook w:firstColumn="1" w:firstRow="1" w:lastColumn="0" w:lastRow="0" w:noHBand="0" w:noVBand="1" w:val="04A0"/>
+      </w:tblPr>
+      <w:tblGrid>
+        <w:gridCol w:w="825"/>
+        <w:gridCol w:w="825"/>
+        <w:gridCol w:w="825"/>
+        <w:gridCol w:w="825"/>
+        <w:gridCol w:w="825"/>
+        <w:gridCol w:w="825"/>
+        <w:gridCol w:w="825"/>
+        <w:gridCol w:w="825"/>
+        <w:gridCol w:w="825"/>
+        <w:gridCol w:w="825"/>
+        <w:gridCol w:w="825"/>
+      </w:tblGrid>
+      <w:tr>
+        <w:tc>
+          <w:tcPr>
+            <w:tcW w:type="dxa" w:w="825"/>
+            <w:shd w:val="clear" w:color="auto" w:fill="D9D9D9"/>
+          </w:tcPr>
+          <w:p>
+            <w:pPr>
+              <w:spacing w:after="40"/>
+              <w:jc w:val="center"/>
+            </w:pPr>
+            <w:r/>
+            <w:r>
+              <w:rPr>
+                <w:b/>
+                <w:sz w:val="20"/>
+              </w:rPr>
+              <w:t>0</w:t>
+            </w:r>
+          </w:p>
+        </w:tc>
+        <w:tc>
+          <w:tcPr>
+            <w:tcW w:type="dxa" w:w="825"/>
+            <w:shd w:val="clear" w:color="auto" w:fill="D9D9D9"/>
+          </w:tcPr>
+          <w:p>
+            <w:pPr>
+              <w:spacing w:after="40"/>
+              <w:jc w:val="center"/>
+            </w:pPr>
+            <w:r/>
+            <w:r>
+              <w:rPr>
+                <w:b/>
+                <w:sz w:val="20"/>
+              </w:rPr>
+              <w:t>1</w:t>
+            </w:r>
+          </w:p>
+        </w:tc>
+        <w:tc>
+          <w:tcPr>
+            <w:tcW w:type="dxa" w:w="825"/>
+            <w:shd w:val="clear" w:color="auto" w:fill="D9D9D9"/>
+          </w:tcPr>
+          <w:p>
+            <w:pPr>
+              <w:spacing w:after="40"/>
+              <w:jc w:val="center"/>
+            </w:pPr>
+            <w:r/>
+            <w:r>
+              <w:rPr>
+                <w:b/>
+                <w:sz w:val="20"/>
+              </w:rPr>
+              <w:t>2</w:t>
+            </w:r>
+          </w:p>
+        </w:tc>
+        <w:tc>
+          <w:tcPr>
+            <w:tcW w:type="dxa" w:w="825"/>
+            <w:shd w:val="clear" w:color="auto" w:fill="D9D9D9"/>
+          </w:tcPr>
+          <w:p>
+            <w:pPr>
+              <w:spacing w:after="40"/>
+              <w:jc w:val="center"/>
+            </w:pPr>
+            <w:r/>
+            <w:r>
+              <w:rPr>
+                <w:b/>
+                <w:sz w:val="20"/>
+              </w:rPr>
+              <w:t>3</w:t>
+            </w:r>
+          </w:p>
+        </w:tc>
+        <w:tc>
+          <w:tcPr>
+            <w:tcW w:type="dxa" w:w="825"/>
+            <w:shd w:val="clear" w:color="auto" w:fill="D9D9D9"/>
+          </w:tcPr>
+          <w:p>
+            <w:pPr>
+              <w:spacing w:after="40"/>
+              <w:jc w:val="center"/>
+            </w:pPr>
+            <w:r/>
+            <w:r>
+              <w:rPr>
+                <w:b/>
+                <w:sz w:val="20"/>
+              </w:rPr>
+              <w:t>4</w:t>
+            </w:r>
+          </w:p>
+        </w:tc>
+        <w:tc>
+          <w:tcPr>
+            <w:tcW w:type="dxa" w:w="825"/>
+            <w:shd w:val="clear" w:color="auto" w:fill="D9D9D9"/>
+          </w:tcPr>
+          <w:p>
+            <w:pPr>
+              <w:spacing w:after="40"/>
+              <w:jc w:val="center"/>
+            </w:pPr>
+            <w:r/>
+            <w:r>
+              <w:rPr>
+                <w:b/>
+                <w:sz w:val="20"/>
+              </w:rPr>
+              <w:t>5</w:t>
+            </w:r>
+          </w:p>
+        </w:tc>
+        <w:tc>
+          <w:tcPr>
+            <w:tcW w:type="dxa" w:w="825"/>
+            <w:shd w:val="clear" w:color="auto" w:fill="D9D9D9"/>
+          </w:tcPr>
+          <w:p>
+            <w:pPr>
+              <w:spacing w:after="40"/>
+              <w:jc w:val="center"/>
+            </w:pPr>
+            <w:r/>
+            <w:r>
+              <w:rPr>
+                <w:b/>
+                <w:sz w:val="20"/>
+              </w:rPr>
+              <w:t>6</w:t>
+            </w:r>
+          </w:p>
+        </w:tc>
+        <w:tc>
+          <w:tcPr>
+            <w:tcW w:type="dxa" w:w="825"/>
+            <w:shd w:val="clear" w:color="auto" w:fill="D9D9D9"/>
+          </w:tcPr>
+          <w:p>
+            <w:pPr>
+              <w:spacing w:after="40"/>
+              <w:jc w:val="center"/>
+            </w:pPr>
+            <w:r/>
+            <w:r>
+              <w:rPr>
+                <w:b/>
+                <w:sz w:val="20"/>
+              </w:rPr>
+              <w:t>7</w:t>
+            </w:r>
+          </w:p>
+        </w:tc>
+        <w:tc>
+          <w:tcPr>
+            <w:tcW w:type="dxa" w:w="825"/>
+            <w:shd w:val="clear" w:color="auto" w:fill="D9D9D9"/>
+          </w:tcPr>
+          <w:p>
+            <w:pPr>
+              <w:spacing w:after="40"/>
+              <w:jc w:val="center"/>
+            </w:pPr>
+            <w:r/>
+            <w:r>
+              <w:rPr>
+                <w:b/>
+                <w:sz w:val="20"/>
+              </w:rPr>
+              <w:t>8</w:t>
+            </w:r>
+          </w:p>
+        </w:tc>
+        <w:tc>
+          <w:tcPr>
+            <w:tcW w:type="dxa" w:w="825"/>
+            <w:shd w:val="clear" w:color="auto" w:fill="D9D9D9"/>
+          </w:tcPr>
+          <w:p>
+            <w:pPr>
+              <w:spacing w:after="40"/>
+              <w:jc w:val="center"/>
+            </w:pPr>
+            <w:r/>
+            <w:r>
+              <w:rPr>
+                <w:b/>
+                <w:sz w:val="20"/>
+              </w:rPr>
+              <w:t>9</w:t>
+            </w:r>
+          </w:p>
+        </w:tc>
+        <w:tc>
+          <w:tcPr>
+            <w:tcW w:type="dxa" w:w="825"/>
+            <w:shd w:val="clear" w:color="auto" w:fill="D9D9D9"/>
+          </w:tcPr>
+          <w:p>
+            <w:pPr>
+              <w:spacing w:after="40"/>
+              <w:jc w:val="center"/>
+            </w:pPr>
+            <w:r/>
+            <w:r>
+              <w:rPr>
+                <w:b/>
+                <w:sz w:val="20"/>
+              </w:rPr>
+              <w:t>10</w:t>
+            </w:r>
+          </w:p>
+        </w:tc>
+      </w:tr>
+      <w:tr>
+        <w:tc>
+          <w:tcPr>
+            <w:tcW w:type="dxa" w:w="825"/>
+          </w:tcPr>
+          <w:p>
+            <w:pPr>
+              <w:spacing w:after="40"/>
+              <w:jc w:val="center"/>
+            </w:pPr>
+            <w:r/>
+            <w:r>
+              <w:rPr>
+                <w:b w:val="0"/>
+                <w:sz w:val="20"/>
+              </w:rPr>
+              <w:t>( )</w:t>
+            </w:r>
+          </w:p>
+        </w:tc>
+        <w:tc>
+          <w:tcPr>
+            <w:tcW w:type="dxa" w:w="825"/>
+          </w:tcPr>
+          <w:p>
+            <w:pPr>
+              <w:spacing w:after="40"/>
+              <w:jc w:val="center"/>
+            </w:pPr>
+            <w:r/>
+            <w:r>
+              <w:rPr>
+                <w:b w:val="0"/>
+                <w:sz w:val="20"/>
+              </w:rPr>
+              <w:t>( )</w:t>
+            </w:r>
+          </w:p>
+        </w:tc>
+        <w:tc>
+          <w:tcPr>
+            <w:tcW w:type="dxa" w:w="825"/>
+          </w:tcPr>
+          <w:p>
+            <w:pPr>
+              <w:spacing w:after="40"/>
+              <w:jc w:val="center"/>
+            </w:pPr>
+            <w:r/>
+            <w:r>
+              <w:rPr>
+                <w:b w:val="0"/>
+                <w:sz w:val="20"/>
+              </w:rPr>
+              <w:t>( )</w:t>
+            </w:r>
+          </w:p>
+        </w:tc>
+        <w:tc>
+          <w:tcPr>
+            <w:tcW w:type="dxa" w:w="825"/>
+          </w:tcPr>
+          <w:p>
+            <w:pPr>
+              <w:spacing w:after="40"/>
+              <w:jc w:val="center"/>
+            </w:pPr>
+            <w:r/>
+            <w:r>
+              <w:rPr>
+                <w:b w:val="0"/>
+                <w:sz w:val="20"/>
+              </w:rPr>
+              <w:t>( )</w:t>
+            </w:r>
+          </w:p>
+        </w:tc>
+        <w:tc>
+          <w:tcPr>
+            <w:tcW w:type="dxa" w:w="825"/>
+          </w:tcPr>
+          <w:p>
+            <w:pPr>
+              <w:spacing w:after="40"/>
+              <w:jc w:val="center"/>
+            </w:pPr>
+            <w:r/>
+            <w:r>
+              <w:rPr>
+                <w:b w:val="0"/>
+                <w:sz w:val="20"/>
+              </w:rPr>
+              <w:t>( )</w:t>
+            </w:r>
+          </w:p>
+        </w:tc>
+        <w:tc>
+          <w:tcPr>
+            <w:tcW w:type="dxa" w:w="825"/>
+          </w:tcPr>
+          <w:p>
+            <w:pPr>
+              <w:spacing w:after="40"/>
+              <w:jc w:val="center"/>
+            </w:pPr>
+            <w:r/>
+            <w:r>
+              <w:rPr>
+                <w:b w:val="0"/>
+                <w:sz w:val="20"/>
+              </w:rPr>
+              <w:t>( )</w:t>
+            </w:r>
+          </w:p>
+        </w:tc>
+        <w:tc>
+          <w:tcPr>
+            <w:tcW w:type="dxa" w:w="825"/>
+          </w:tcPr>
+          <w:p>
+            <w:pPr>
+              <w:spacing w:after="40"/>
+              <w:jc w:val="center"/>
+            </w:pPr>
+            <w:r/>
+            <w:r>
+              <w:rPr>
+                <w:b w:val="0"/>
+                <w:sz w:val="20"/>
+              </w:rPr>
+              <w:t>( )</w:t>
+            </w:r>
+          </w:p>
+        </w:tc>
+        <w:tc>
+          <w:tcPr>
+            <w:tcW w:type="dxa" w:w="825"/>
+          </w:tcPr>
+          <w:p>
+            <w:pPr>
+              <w:spacing w:after="40"/>
+              <w:jc w:val="center"/>
+            </w:pPr>
+            <w:r/>
+            <w:r>
+              <w:rPr>
+                <w:b w:val="0"/>
+                <w:sz w:val="20"/>
+              </w:rPr>
+              <w:t>(X)</w:t>
+            </w:r>
+          </w:p>
+        </w:tc>
+        <w:tc>
+          <w:tcPr>
+            <w:tcW w:type="dxa" w:w="825"/>
+          </w:tcPr>
+          <w:p>
+            <w:pPr>
+              <w:spacing w:after="40"/>
+              <w:jc w:val="center"/>
+            </w:pPr>
+            <w:r/>
+            <w:r>
+              <w:rPr>
+                <w:b w:val="0"/>
+                <w:sz w:val="20"/>
+              </w:rPr>
+              <w:t>( )</w:t>
+            </w:r>
+          </w:p>
+        </w:tc>
+        <w:tc>
+          <w:tcPr>
+            <w:tcW w:type="dxa" w:w="825"/>
+          </w:tcPr>
+          <w:p>
+            <w:pPr>
+              <w:spacing w:after="40"/>
+              <w:jc w:val="center"/>
+            </w:pPr>
+            <w:r/>
+            <w:r>
+              <w:rPr>
+                <w:b w:val="0"/>
+                <w:sz w:val="20"/>
+              </w:rPr>
+              <w:t>( )</w:t>
+            </w:r>
+          </w:p>
+        </w:tc>
+        <w:tc>
+          <w:tcPr>
+            <w:tcW w:type="dxa" w:w="825"/>
+          </w:tcPr>
+          <w:p>
+            <w:pPr>
+              <w:spacing w:after="40"/>
+              <w:jc w:val="center"/>
+            </w:pPr>
+            <w:r/>
+            <w:r>
+              <w:rPr>
+                <w:b w:val="0"/>
+                <w:sz w:val="20"/>
+              </w:rPr>
+              <w:t>( )</w:t>
+            </w:r>
+          </w:p>
+        </w:tc>
+      </w:tr>
+    </w:tbl>
+    <w:p/>
+    <w:p>
+      <w:pPr>
+        <w:spacing w:after="120"/>
+      </w:pPr>
+      <w:r>
+        <w:rPr>
+          <w:b/>
+          <w:sz w:val="20"/>
+        </w:rPr>
+        <w:t>7. Caso queira contribuir com maior detalhamento, traga seu depoimento/ sugestão.</w:t>
+      </w:r>
+    </w:p>
+    <w:p>
+      <w:pPr>
+        <w:spacing w:after="120"/>
+      </w:pPr>
       <w:r>
         <w:rPr>
           <w:b w:val="0"/>
           <w:sz w:val="22"/>
         </w:rPr>
-        <w:t>1. A atividade permitiu o desenvolvimento do projeto articulando competências e conteúdos do Curso? Nota: 9</w:t>
-      </w:r>
-    </w:p>
-    <w:p>
-      <w:r>
-        <w:rPr>
-          <w:b w:val="0"/>
-          <w:sz w:val="22"/>
-        </w:rPr>
-        <w:t>2. A atividade possui carga horária suficiente para a sua realização? Nota: 8</w:t>
-      </w:r>
-    </w:p>
-    <w:p>
-      <w:r>
-        <w:rPr>
-          <w:b w:val="0"/>
-          <w:sz w:val="22"/>
-        </w:rPr>
-        <w:t>3. A atividade é relevante para a sua formação e articulação de competências e conteúdos? Nota: 9</w:t>
-      </w:r>
-    </w:p>
-    <w:p>
-      <w:r>
-        <w:rPr>
-          <w:b w:val="0"/>
-          <w:sz w:val="22"/>
-        </w:rPr>
-        <w:t>4. A atividade contribui para os objetivos da IES e do Curso (PDI e PPC)? Nota: 8</w:t>
-      </w:r>
-    </w:p>
-    <w:p>
-      <w:r>
-        <w:rPr>
-          <w:b w:val="0"/>
-          <w:sz w:val="22"/>
-        </w:rPr>
-        <w:t>5. A atividade contribui para a melhoria da sociedade pelos resultados demonstrados? Nota: 5</w:t>
-      </w:r>
-    </w:p>
-    <w:p>
-      <w:r>
-        <w:rPr>
-          <w:b w:val="0"/>
-          <w:sz w:val="22"/>
-        </w:rPr>
-        <w:t>6. A atividade permite o desenvolvimento de ações junto à Iniciação Científica e ao Ensino? Nota: 7</w:t>
-      </w:r>
-    </w:p>
-    <w:p>
-      <w:r>
-        <w:rPr>
-          <w:b w:val="0"/>
-          <w:sz w:val="22"/>
-        </w:rPr>
-        <w:t>7. Depoimento/sugestão: por ter sido um estudo simulado, a contribuição social ficou no campo do planejamento; sugiro que o componente ofereça uma lista de parceiros culturais por polo para facilitar a execução real.</w:t>
+        <w:t>Por ter sido um estudo simulado, a contribuição social ficou no campo do planejamento; sugiro que o componente ofereça uma lista de parceiros culturais por polo para facilitar a execução real.</w:t>
       </w:r>
     </w:p>
     <w:sectPr>
@@ -830,6 +4332,10 @@
     <w:name w:val="Normal"/>
     <w:qFormat/>
     <w:rsid w:val="00FC693F"/>
+    <w:rPr>
+      <w:rFonts w:ascii="Arial" w:hAnsi="Arial" w:eastAsia="Arial"/>
+      <w:sz w:val="22"/>
+    </w:rPr>
   </w:style>
   <w:style w:type="paragraph" w:styleId="Header">
     <w:name w:val="header"/>

</xml_diff>